<commit_message>
Added data to DB and Did logos in visual diary
</commit_message>
<xml_diff>
--- a/L2DTS - 91892 Database Visual Diary.docx
+++ b/L2DTS - 91892 Database Visual Diary.docx
@@ -136,7 +136,25 @@
           <w:sz w:val="24"/>
           <w:szCs w:val="24"/>
         </w:rPr>
-        <w:t>It will includes a table for: 1) Orders. 2) Stock. 3) Customers. 4)</w:t>
+        <w:t xml:space="preserve">It will </w:t>
+      </w:r>
+      <w:proofErr w:type="gramStart"/>
+      <w:r>
+        <w:rPr>
+          <w:rFonts w:ascii="Times New Roman" w:hAnsi="Times New Roman" w:cs="Times New Roman"/>
+          <w:sz w:val="24"/>
+          <w:szCs w:val="24"/>
+        </w:rPr>
+        <w:t>includes</w:t>
+      </w:r>
+      <w:proofErr w:type="gramEnd"/>
+      <w:r>
+        <w:rPr>
+          <w:rFonts w:ascii="Times New Roman" w:hAnsi="Times New Roman" w:cs="Times New Roman"/>
+          <w:sz w:val="24"/>
+          <w:szCs w:val="24"/>
+        </w:rPr>
+        <w:t xml:space="preserve"> a table for: 1) Orders. 2) Stock. 3) Customers. 4)</w:t>
       </w:r>
       <w:r>
         <w:rPr>
@@ -153,6 +171,14 @@
           <w:szCs w:val="24"/>
         </w:rPr>
         <w:t xml:space="preserve">5) </w:t>
+      </w:r>
+      <w:r>
+        <w:rPr>
+          <w:rFonts w:ascii="Times New Roman" w:hAnsi="Times New Roman" w:cs="Times New Roman"/>
+          <w:sz w:val="24"/>
+          <w:szCs w:val="24"/>
+        </w:rPr>
+        <w:t>Order Items</w:t>
       </w:r>
     </w:p>
     <w:p>
@@ -320,7 +346,25 @@
                 <w:sz w:val="20"/>
                 <w:szCs w:val="20"/>
               </w:rPr>
-              <w:t>Linking data in related tables or nodes using queries or keys</w:t>
+              <w:t xml:space="preserve">Linking data </w:t>
+            </w:r>
+            <w:proofErr w:type="gramStart"/>
+            <w:r>
+              <w:rPr>
+                <w:rFonts w:ascii="Times New Roman" w:hAnsi="Times New Roman" w:cs="Times New Roman"/>
+                <w:sz w:val="20"/>
+                <w:szCs w:val="20"/>
+              </w:rPr>
+              <w:t>in</w:t>
+            </w:r>
+            <w:proofErr w:type="gramEnd"/>
+            <w:r>
+              <w:rPr>
+                <w:rFonts w:ascii="Times New Roman" w:hAnsi="Times New Roman" w:cs="Times New Roman"/>
+                <w:sz w:val="20"/>
+                <w:szCs w:val="20"/>
+              </w:rPr>
+              <w:t xml:space="preserve"> related tables or nodes using queries or keys</w:t>
             </w:r>
           </w:p>
         </w:tc>
@@ -449,13 +493,23 @@
                 <w:szCs w:val="20"/>
               </w:rPr>
             </w:pPr>
-            <w:r>
-              <w:rPr>
-                <w:rFonts w:ascii="Times New Roman" w:hAnsi="Times New Roman" w:cs="Times New Roman"/>
-                <w:sz w:val="20"/>
-                <w:szCs w:val="20"/>
-              </w:rPr>
-              <w:t>Customising presentation of the data</w:t>
+            <w:proofErr w:type="spellStart"/>
+            <w:r>
+              <w:rPr>
+                <w:rFonts w:ascii="Times New Roman" w:hAnsi="Times New Roman" w:cs="Times New Roman"/>
+                <w:sz w:val="20"/>
+                <w:szCs w:val="20"/>
+              </w:rPr>
+              <w:t>Customising</w:t>
+            </w:r>
+            <w:proofErr w:type="spellEnd"/>
+            <w:r>
+              <w:rPr>
+                <w:rFonts w:ascii="Times New Roman" w:hAnsi="Times New Roman" w:cs="Times New Roman"/>
+                <w:sz w:val="20"/>
+                <w:szCs w:val="20"/>
+              </w:rPr>
+              <w:t xml:space="preserve"> presentation of the data</w:t>
             </w:r>
           </w:p>
         </w:tc>
@@ -601,6 +655,306 @@
         <w:t>Logo Design for Database</w:t>
       </w:r>
     </w:p>
+    <w:tbl>
+      <w:tblPr>
+        <w:tblStyle w:val="TableGrid"/>
+        <w:tblW w:w="0" w:type="auto"/>
+        <w:tblLook w:val="04A0" w:firstRow="1" w:lastRow="0" w:firstColumn="1" w:lastColumn="0" w:noHBand="0" w:noVBand="1"/>
+      </w:tblPr>
+      <w:tblGrid>
+        <w:gridCol w:w="4675"/>
+        <w:gridCol w:w="4675"/>
+      </w:tblGrid>
+      <w:tr>
+        <w:tc>
+          <w:tcPr>
+            <w:tcW w:w="4675" w:type="dxa"/>
+          </w:tcPr>
+          <w:p>
+            <w:pPr>
+              <w:rPr>
+                <w:rFonts w:ascii="Times New Roman" w:hAnsi="Times New Roman" w:cs="Times New Roman"/>
+                <w:sz w:val="24"/>
+                <w:szCs w:val="24"/>
+              </w:rPr>
+            </w:pPr>
+            <w:r>
+              <w:rPr>
+                <w:rFonts w:ascii="Times New Roman" w:hAnsi="Times New Roman" w:cs="Times New Roman"/>
+                <w:sz w:val="24"/>
+                <w:szCs w:val="24"/>
+              </w:rPr>
+              <w:drawing>
+                <wp:inline distT="0" distB="0" distL="0" distR="0" wp14:anchorId="2F47CFD3" wp14:editId="1E2C1CBB">
+                  <wp:extent cx="1925142" cy="276225"/>
+                  <wp:effectExtent l="0" t="0" r="0" b="0"/>
+                  <wp:docPr id="2132868579" name="Picture 1"/>
+                  <wp:cNvGraphicFramePr>
+                    <a:graphicFrameLocks xmlns:a="http://schemas.openxmlformats.org/drawingml/2006/main" noChangeAspect="1"/>
+                  </wp:cNvGraphicFramePr>
+                  <a:graphic xmlns:a="http://schemas.openxmlformats.org/drawingml/2006/main">
+                    <a:graphicData uri="http://schemas.openxmlformats.org/drawingml/2006/picture">
+                      <pic:pic xmlns:pic="http://schemas.openxmlformats.org/drawingml/2006/picture">
+                        <pic:nvPicPr>
+                          <pic:cNvPr id="2132868579" name=""/>
+                          <pic:cNvPicPr/>
+                        </pic:nvPicPr>
+                        <pic:blipFill>
+                          <a:blip r:embed="rId5"/>
+                          <a:stretch>
+                            <a:fillRect/>
+                          </a:stretch>
+                        </pic:blipFill>
+                        <pic:spPr>
+                          <a:xfrm>
+                            <a:off x="0" y="0"/>
+                            <a:ext cx="1963385" cy="281712"/>
+                          </a:xfrm>
+                          <a:prstGeom prst="rect">
+                            <a:avLst/>
+                          </a:prstGeom>
+                        </pic:spPr>
+                      </pic:pic>
+                    </a:graphicData>
+                  </a:graphic>
+                </wp:inline>
+              </w:drawing>
+            </w:r>
+          </w:p>
+        </w:tc>
+        <w:tc>
+          <w:tcPr>
+            <w:tcW w:w="4675" w:type="dxa"/>
+          </w:tcPr>
+          <w:p>
+            <w:pPr>
+              <w:rPr>
+                <w:rFonts w:ascii="Times New Roman" w:hAnsi="Times New Roman" w:cs="Times New Roman"/>
+                <w:sz w:val="24"/>
+                <w:szCs w:val="24"/>
+              </w:rPr>
+            </w:pPr>
+          </w:p>
+        </w:tc>
+      </w:tr>
+      <w:tr>
+        <w:tc>
+          <w:tcPr>
+            <w:tcW w:w="4675" w:type="dxa"/>
+          </w:tcPr>
+          <w:p>
+            <w:pPr>
+              <w:rPr>
+                <w:rFonts w:ascii="Times New Roman" w:hAnsi="Times New Roman" w:cs="Times New Roman"/>
+                <w:sz w:val="24"/>
+                <w:szCs w:val="24"/>
+              </w:rPr>
+            </w:pPr>
+            <w:r>
+              <w:rPr>
+                <w:rFonts w:ascii="Times New Roman" w:hAnsi="Times New Roman" w:cs="Times New Roman"/>
+                <w:sz w:val="24"/>
+                <w:szCs w:val="24"/>
+              </w:rPr>
+              <w:drawing>
+                <wp:inline distT="0" distB="0" distL="0" distR="0" wp14:anchorId="5487554B" wp14:editId="0822FEAC">
+                  <wp:extent cx="1924685" cy="923684"/>
+                  <wp:effectExtent l="0" t="0" r="0" b="0"/>
+                  <wp:docPr id="28899338" name="Picture 1"/>
+                  <wp:cNvGraphicFramePr>
+                    <a:graphicFrameLocks xmlns:a="http://schemas.openxmlformats.org/drawingml/2006/main" noChangeAspect="1"/>
+                  </wp:cNvGraphicFramePr>
+                  <a:graphic xmlns:a="http://schemas.openxmlformats.org/drawingml/2006/main">
+                    <a:graphicData uri="http://schemas.openxmlformats.org/drawingml/2006/picture">
+                      <pic:pic xmlns:pic="http://schemas.openxmlformats.org/drawingml/2006/picture">
+                        <pic:nvPicPr>
+                          <pic:cNvPr id="28899338" name=""/>
+                          <pic:cNvPicPr/>
+                        </pic:nvPicPr>
+                        <pic:blipFill>
+                          <a:blip r:embed="rId6"/>
+                          <a:stretch>
+                            <a:fillRect/>
+                          </a:stretch>
+                        </pic:blipFill>
+                        <pic:spPr>
+                          <a:xfrm>
+                            <a:off x="0" y="0"/>
+                            <a:ext cx="1940738" cy="931388"/>
+                          </a:xfrm>
+                          <a:prstGeom prst="rect">
+                            <a:avLst/>
+                          </a:prstGeom>
+                        </pic:spPr>
+                      </pic:pic>
+                    </a:graphicData>
+                  </a:graphic>
+                </wp:inline>
+              </w:drawing>
+            </w:r>
+          </w:p>
+        </w:tc>
+        <w:tc>
+          <w:tcPr>
+            <w:tcW w:w="4675" w:type="dxa"/>
+          </w:tcPr>
+          <w:p>
+            <w:pPr>
+              <w:rPr>
+                <w:rFonts w:ascii="Times New Roman" w:hAnsi="Times New Roman" w:cs="Times New Roman"/>
+                <w:sz w:val="24"/>
+                <w:szCs w:val="24"/>
+              </w:rPr>
+            </w:pPr>
+          </w:p>
+        </w:tc>
+      </w:tr>
+      <w:tr>
+        <w:tc>
+          <w:tcPr>
+            <w:tcW w:w="4675" w:type="dxa"/>
+          </w:tcPr>
+          <w:p>
+            <w:pPr>
+              <w:rPr>
+                <w:rFonts w:ascii="Times New Roman" w:hAnsi="Times New Roman" w:cs="Times New Roman"/>
+                <w:sz w:val="24"/>
+                <w:szCs w:val="24"/>
+              </w:rPr>
+            </w:pPr>
+            <w:r>
+              <w:rPr>
+                <w:rFonts w:ascii="Times New Roman" w:hAnsi="Times New Roman" w:cs="Times New Roman"/>
+                <w:sz w:val="24"/>
+                <w:szCs w:val="24"/>
+              </w:rPr>
+              <w:drawing>
+                <wp:inline distT="0" distB="0" distL="0" distR="0" wp14:anchorId="1F7AC7AF" wp14:editId="331C174B">
+                  <wp:extent cx="1924685" cy="621821"/>
+                  <wp:effectExtent l="0" t="0" r="0" b="6985"/>
+                  <wp:docPr id="977647227" name="Picture 1"/>
+                  <wp:cNvGraphicFramePr>
+                    <a:graphicFrameLocks xmlns:a="http://schemas.openxmlformats.org/drawingml/2006/main" noChangeAspect="1"/>
+                  </wp:cNvGraphicFramePr>
+                  <a:graphic xmlns:a="http://schemas.openxmlformats.org/drawingml/2006/main">
+                    <a:graphicData uri="http://schemas.openxmlformats.org/drawingml/2006/picture">
+                      <pic:pic xmlns:pic="http://schemas.openxmlformats.org/drawingml/2006/picture">
+                        <pic:nvPicPr>
+                          <pic:cNvPr id="977647227" name=""/>
+                          <pic:cNvPicPr/>
+                        </pic:nvPicPr>
+                        <pic:blipFill>
+                          <a:blip r:embed="rId7"/>
+                          <a:stretch>
+                            <a:fillRect/>
+                          </a:stretch>
+                        </pic:blipFill>
+                        <pic:spPr>
+                          <a:xfrm>
+                            <a:off x="0" y="0"/>
+                            <a:ext cx="1943763" cy="627985"/>
+                          </a:xfrm>
+                          <a:prstGeom prst="rect">
+                            <a:avLst/>
+                          </a:prstGeom>
+                        </pic:spPr>
+                      </pic:pic>
+                    </a:graphicData>
+                  </a:graphic>
+                </wp:inline>
+              </w:drawing>
+            </w:r>
+          </w:p>
+        </w:tc>
+        <w:tc>
+          <w:tcPr>
+            <w:tcW w:w="4675" w:type="dxa"/>
+          </w:tcPr>
+          <w:p>
+            <w:pPr>
+              <w:rPr>
+                <w:rFonts w:ascii="Times New Roman" w:hAnsi="Times New Roman" w:cs="Times New Roman"/>
+                <w:sz w:val="24"/>
+                <w:szCs w:val="24"/>
+              </w:rPr>
+            </w:pPr>
+          </w:p>
+        </w:tc>
+      </w:tr>
+      <w:tr>
+        <w:tc>
+          <w:tcPr>
+            <w:tcW w:w="4675" w:type="dxa"/>
+          </w:tcPr>
+          <w:p>
+            <w:pPr>
+              <w:rPr>
+                <w:rFonts w:ascii="Times New Roman" w:hAnsi="Times New Roman" w:cs="Times New Roman"/>
+                <w:sz w:val="24"/>
+                <w:szCs w:val="24"/>
+              </w:rPr>
+            </w:pPr>
+            <w:r>
+              <w:rPr>
+                <w:rFonts w:ascii="Times New Roman" w:hAnsi="Times New Roman" w:cs="Times New Roman"/>
+                <w:noProof/>
+                <w:sz w:val="24"/>
+                <w:szCs w:val="24"/>
+              </w:rPr>
+              <w:drawing>
+                <wp:inline distT="0" distB="0" distL="0" distR="0" wp14:anchorId="749BC515" wp14:editId="3A0F02C9">
+                  <wp:extent cx="1924685" cy="681865"/>
+                  <wp:effectExtent l="0" t="0" r="0" b="4445"/>
+                  <wp:docPr id="1863219276" name="Picture 1"/>
+                  <wp:cNvGraphicFramePr>
+                    <a:graphicFrameLocks xmlns:a="http://schemas.openxmlformats.org/drawingml/2006/main" noChangeAspect="1"/>
+                  </wp:cNvGraphicFramePr>
+                  <a:graphic xmlns:a="http://schemas.openxmlformats.org/drawingml/2006/main">
+                    <a:graphicData uri="http://schemas.openxmlformats.org/drawingml/2006/picture">
+                      <pic:pic xmlns:pic="http://schemas.openxmlformats.org/drawingml/2006/picture">
+                        <pic:nvPicPr>
+                          <pic:cNvPr id="1863219276" name="Picture 1863219276"/>
+                          <pic:cNvPicPr/>
+                        </pic:nvPicPr>
+                        <pic:blipFill>
+                          <a:blip r:embed="rId8"/>
+                          <a:stretch>
+                            <a:fillRect/>
+                          </a:stretch>
+                        </pic:blipFill>
+                        <pic:spPr>
+                          <a:xfrm>
+                            <a:off x="0" y="0"/>
+                            <a:ext cx="1948142" cy="690175"/>
+                          </a:xfrm>
+                          <a:prstGeom prst="rect">
+                            <a:avLst/>
+                          </a:prstGeom>
+                        </pic:spPr>
+                      </pic:pic>
+                    </a:graphicData>
+                  </a:graphic>
+                </wp:inline>
+              </w:drawing>
+            </w:r>
+          </w:p>
+        </w:tc>
+        <w:tc>
+          <w:tcPr>
+            <w:tcW w:w="4675" w:type="dxa"/>
+          </w:tcPr>
+          <w:p>
+            <w:pPr>
+              <w:rPr>
+                <w:rFonts w:ascii="Times New Roman" w:hAnsi="Times New Roman" w:cs="Times New Roman"/>
+                <w:sz w:val="24"/>
+                <w:szCs w:val="24"/>
+              </w:rPr>
+            </w:pPr>
+          </w:p>
+        </w:tc>
+      </w:tr>
+    </w:tbl>
     <w:p>
       <w:pPr>
         <w:rPr>
@@ -700,6 +1054,7 @@
           <w:sz w:val="24"/>
           <w:szCs w:val="24"/>
         </w:rPr>
+        <w:lastRenderedPageBreak/>
         <w:t>Customers Table</w:t>
       </w:r>
     </w:p>
@@ -798,10 +1153,10 @@
       <w:r>
         <w:rPr>
           <w:rFonts w:ascii="Times New Roman" w:hAnsi="Times New Roman" w:cs="Times New Roman"/>
-          <w:sz w:val="24"/>
-          <w:szCs w:val="24"/>
-        </w:rPr>
-        <w:lastRenderedPageBreak/>
+          <w:noProof/>
+          <w:sz w:val="24"/>
+          <w:szCs w:val="24"/>
+        </w:rPr>
         <w:drawing>
           <wp:inline distT="0" distB="0" distL="0" distR="0" wp14:anchorId="111BD477" wp14:editId="316DDE43">
             <wp:extent cx="5943600" cy="5033645"/>
@@ -818,7 +1173,7 @@
                     <pic:cNvPicPr/>
                   </pic:nvPicPr>
                   <pic:blipFill>
-                    <a:blip r:embed="rId5"/>
+                    <a:blip r:embed="rId9"/>
                     <a:stretch>
                       <a:fillRect/>
                     </a:stretch>
@@ -850,6 +1205,7 @@
       <w:r>
         <w:rPr>
           <w:rFonts w:ascii="Times New Roman" w:hAnsi="Times New Roman" w:cs="Times New Roman"/>
+          <w:noProof/>
           <w:sz w:val="24"/>
           <w:szCs w:val="24"/>
         </w:rPr>
@@ -870,7 +1226,7 @@
                     <pic:cNvPicPr/>
                   </pic:nvPicPr>
                   <pic:blipFill>
-                    <a:blip r:embed="rId6"/>
+                    <a:blip r:embed="rId10"/>
                     <a:stretch>
                       <a:fillRect/>
                     </a:stretch>
@@ -1494,6 +1850,7 @@
                 <w:szCs w:val="24"/>
               </w:rPr>
             </w:pPr>
+            <w:proofErr w:type="gramStart"/>
             <w:r>
               <w:rPr>
                 <w:rFonts w:ascii="Times New Roman" w:hAnsi="Times New Roman" w:cs="Times New Roman"/>
@@ -1503,6 +1860,7 @@
               </w:rPr>
               <w:t>Address Relevant Implication</w:t>
             </w:r>
+            <w:proofErr w:type="gramEnd"/>
             <w:r>
               <w:rPr>
                 <w:rFonts w:ascii="Times New Roman" w:hAnsi="Times New Roman" w:cs="Times New Roman"/>
@@ -2493,13 +2851,23 @@
                 <w:szCs w:val="20"/>
               </w:rPr>
             </w:pPr>
-            <w:r>
-              <w:rPr>
-                <w:rFonts w:ascii="Times New Roman" w:hAnsi="Times New Roman" w:cs="Times New Roman"/>
-                <w:sz w:val="20"/>
-                <w:szCs w:val="20"/>
-              </w:rPr>
-              <w:t>Enter Alphabets in Age Field</w:t>
+            <w:proofErr w:type="gramStart"/>
+            <w:r>
+              <w:rPr>
+                <w:rFonts w:ascii="Times New Roman" w:hAnsi="Times New Roman" w:cs="Times New Roman"/>
+                <w:sz w:val="20"/>
+                <w:szCs w:val="20"/>
+              </w:rPr>
+              <w:t>Enter</w:t>
+            </w:r>
+            <w:proofErr w:type="gramEnd"/>
+            <w:r>
+              <w:rPr>
+                <w:rFonts w:ascii="Times New Roman" w:hAnsi="Times New Roman" w:cs="Times New Roman"/>
+                <w:sz w:val="20"/>
+                <w:szCs w:val="20"/>
+              </w:rPr>
+              <w:t xml:space="preserve"> Alphabets in Age Field</w:t>
             </w:r>
           </w:p>
         </w:tc>
@@ -4150,7 +4518,25 @@
           <w:sz w:val="18"/>
           <w:szCs w:val="24"/>
         </w:rPr>
-        <w:t>Make sure to record iterative improvement in the below table as well as video evidence.)</w:t>
+        <w:t xml:space="preserve">Make sure to record iterative improvement in the </w:t>
+      </w:r>
+      <w:proofErr w:type="gramStart"/>
+      <w:r>
+        <w:rPr>
+          <w:rFonts w:ascii="Times New Roman" w:hAnsi="Times New Roman" w:cs="Times New Roman"/>
+          <w:sz w:val="18"/>
+          <w:szCs w:val="24"/>
+        </w:rPr>
+        <w:t>below table</w:t>
+      </w:r>
+      <w:proofErr w:type="gramEnd"/>
+      <w:r>
+        <w:rPr>
+          <w:rFonts w:ascii="Times New Roman" w:hAnsi="Times New Roman" w:cs="Times New Roman"/>
+          <w:sz w:val="18"/>
+          <w:szCs w:val="24"/>
+        </w:rPr>
+        <w:t xml:space="preserve"> as well as video evidence.)</w:t>
       </w:r>
     </w:p>
     <w:p>
@@ -4187,7 +4573,27 @@
           <w:sz w:val="18"/>
           <w:szCs w:val="24"/>
         </w:rPr>
-        <w:t xml:space="preserve"> is required throughout the design, development and testing process.</w:t>
+        <w:t xml:space="preserve"> </w:t>
+      </w:r>
+      <w:proofErr w:type="gramStart"/>
+      <w:r>
+        <w:rPr>
+          <w:rFonts w:ascii="Times New Roman" w:hAnsi="Times New Roman" w:cs="Times New Roman"/>
+          <w:color w:val="FF0000"/>
+          <w:sz w:val="18"/>
+          <w:szCs w:val="24"/>
+        </w:rPr>
+        <w:t>is</w:t>
+      </w:r>
+      <w:proofErr w:type="gramEnd"/>
+      <w:r>
+        <w:rPr>
+          <w:rFonts w:ascii="Times New Roman" w:hAnsi="Times New Roman" w:cs="Times New Roman"/>
+          <w:color w:val="FF0000"/>
+          <w:sz w:val="18"/>
+          <w:szCs w:val="24"/>
+        </w:rPr>
+        <w:t xml:space="preserve"> required throughout the design, development and testing process.</w:t>
       </w:r>
     </w:p>
     <w:tbl>
@@ -4904,7 +5310,25 @@
           <w:sz w:val="18"/>
           <w:szCs w:val="24"/>
         </w:rPr>
-        <w:t xml:space="preserve"> show how queries, forms, sorting, and field organisation help users easily enter data and retrieve the information they need.)</w:t>
+        <w:t xml:space="preserve"> show how queries, forms, sorting, and field </w:t>
+      </w:r>
+      <w:proofErr w:type="spellStart"/>
+      <w:r>
+        <w:rPr>
+          <w:rFonts w:ascii="Times New Roman" w:hAnsi="Times New Roman" w:cs="Times New Roman"/>
+          <w:sz w:val="18"/>
+          <w:szCs w:val="24"/>
+        </w:rPr>
+        <w:t>organisation</w:t>
+      </w:r>
+      <w:proofErr w:type="spellEnd"/>
+      <w:r>
+        <w:rPr>
+          <w:rFonts w:ascii="Times New Roman" w:hAnsi="Times New Roman" w:cs="Times New Roman"/>
+          <w:sz w:val="18"/>
+          <w:szCs w:val="24"/>
+        </w:rPr>
+        <w:t xml:space="preserve"> help users easily enter data and retrieve the information they need.)</w:t>
       </w:r>
     </w:p>
     <w:sectPr>

</xml_diff>

<commit_message>
Did validation rules on DB, Updated Visual Diary, Updated Data Dictionary
</commit_message>
<xml_diff>
--- a/L2DTS - 91892 Database Visual Diary.docx
+++ b/L2DTS - 91892 Database Visual Diary.docx
@@ -138,16 +138,14 @@
         </w:rPr>
         <w:t xml:space="preserve">It will </w:t>
       </w:r>
-      <w:proofErr w:type="gramStart"/>
-      <w:r>
-        <w:rPr>
-          <w:rFonts w:ascii="Times New Roman" w:hAnsi="Times New Roman" w:cs="Times New Roman"/>
-          <w:sz w:val="24"/>
-          <w:szCs w:val="24"/>
-        </w:rPr>
-        <w:t>includes</w:t>
-      </w:r>
-      <w:proofErr w:type="gramEnd"/>
+      <w:r>
+        <w:rPr>
+          <w:rFonts w:ascii="Times New Roman" w:hAnsi="Times New Roman" w:cs="Times New Roman"/>
+          <w:sz w:val="24"/>
+          <w:szCs w:val="24"/>
+        </w:rPr>
+        <w:t>include</w:t>
+      </w:r>
       <w:r>
         <w:rPr>
           <w:rFonts w:ascii="Times New Roman" w:hAnsi="Times New Roman" w:cs="Times New Roman"/>
@@ -681,6 +679,7 @@
             <w:r>
               <w:rPr>
                 <w:rFonts w:ascii="Times New Roman" w:hAnsi="Times New Roman" w:cs="Times New Roman"/>
+                <w:noProof/>
                 <w:sz w:val="24"/>
                 <w:szCs w:val="24"/>
               </w:rPr>
@@ -753,6 +752,7 @@
             <w:r>
               <w:rPr>
                 <w:rFonts w:ascii="Times New Roman" w:hAnsi="Times New Roman" w:cs="Times New Roman"/>
+                <w:noProof/>
                 <w:sz w:val="24"/>
                 <w:szCs w:val="24"/>
               </w:rPr>
@@ -825,6 +825,7 @@
             <w:r>
               <w:rPr>
                 <w:rFonts w:ascii="Times New Roman" w:hAnsi="Times New Roman" w:cs="Times New Roman"/>
+                <w:noProof/>
                 <w:sz w:val="24"/>
                 <w:szCs w:val="24"/>
               </w:rPr>
@@ -1153,15 +1154,14 @@
       <w:r>
         <w:rPr>
           <w:rFonts w:ascii="Times New Roman" w:hAnsi="Times New Roman" w:cs="Times New Roman"/>
-          <w:noProof/>
           <w:sz w:val="24"/>
           <w:szCs w:val="24"/>
         </w:rPr>
         <w:drawing>
-          <wp:inline distT="0" distB="0" distL="0" distR="0" wp14:anchorId="111BD477" wp14:editId="316DDE43">
-            <wp:extent cx="5943600" cy="5033645"/>
-            <wp:effectExtent l="0" t="0" r="0" b="0"/>
-            <wp:docPr id="833093451" name="Picture 1"/>
+          <wp:inline distT="0" distB="0" distL="0" distR="0" wp14:anchorId="2BAF6354" wp14:editId="31BAAF5F">
+            <wp:extent cx="5943600" cy="4335145"/>
+            <wp:effectExtent l="0" t="0" r="0" b="8255"/>
+            <wp:docPr id="1921730739" name="Picture 1"/>
             <wp:cNvGraphicFramePr>
               <a:graphicFrameLocks xmlns:a="http://schemas.openxmlformats.org/drawingml/2006/main" noChangeAspect="1"/>
             </wp:cNvGraphicFramePr>
@@ -1169,7 +1169,7 @@
               <a:graphicData uri="http://schemas.openxmlformats.org/drawingml/2006/picture">
                 <pic:pic xmlns:pic="http://schemas.openxmlformats.org/drawingml/2006/picture">
                   <pic:nvPicPr>
-                    <pic:cNvPr id="833093451" name=""/>
+                    <pic:cNvPr id="1921730739" name=""/>
                     <pic:cNvPicPr/>
                   </pic:nvPicPr>
                   <pic:blipFill>
@@ -1181,7 +1181,7 @@
                   <pic:spPr>
                     <a:xfrm>
                       <a:off x="0" y="0"/>
-                      <a:ext cx="5943600" cy="5033645"/>
+                      <a:ext cx="5943600" cy="4335145"/>
                     </a:xfrm>
                     <a:prstGeom prst="rect">
                       <a:avLst/>
@@ -1300,6 +1300,703 @@
       <w:pPr>
         <w:rPr>
           <w:rFonts w:ascii="Times New Roman" w:hAnsi="Times New Roman" w:cs="Times New Roman"/>
+          <w:sz w:val="28"/>
+          <w:szCs w:val="28"/>
+        </w:rPr>
+      </w:pPr>
+      <w:r>
+        <w:rPr>
+          <w:rFonts w:ascii="Times New Roman" w:hAnsi="Times New Roman" w:cs="Times New Roman"/>
+          <w:sz w:val="28"/>
+          <w:szCs w:val="28"/>
+        </w:rPr>
+        <w:t>Validation Checks:</w:t>
+      </w:r>
+    </w:p>
+    <w:p>
+      <w:pPr>
+        <w:rPr>
+          <w:rFonts w:ascii="Times New Roman" w:hAnsi="Times New Roman" w:cs="Times New Roman"/>
+          <w:sz w:val="18"/>
+          <w:szCs w:val="24"/>
+        </w:rPr>
+      </w:pPr>
+      <w:r>
+        <w:rPr>
+          <w:rFonts w:ascii="Times New Roman" w:hAnsi="Times New Roman" w:cs="Times New Roman"/>
+          <w:sz w:val="18"/>
+          <w:szCs w:val="24"/>
+        </w:rPr>
+        <w:drawing>
+          <wp:inline distT="0" distB="0" distL="0" distR="0" wp14:anchorId="6D520F0B" wp14:editId="34D72195">
+            <wp:extent cx="2582329" cy="1242060"/>
+            <wp:effectExtent l="0" t="0" r="8890" b="0"/>
+            <wp:docPr id="1279165604" name="Picture 1"/>
+            <wp:cNvGraphicFramePr>
+              <a:graphicFrameLocks xmlns:a="http://schemas.openxmlformats.org/drawingml/2006/main" noChangeAspect="1"/>
+            </wp:cNvGraphicFramePr>
+            <a:graphic xmlns:a="http://schemas.openxmlformats.org/drawingml/2006/main">
+              <a:graphicData uri="http://schemas.openxmlformats.org/drawingml/2006/picture">
+                <pic:pic xmlns:pic="http://schemas.openxmlformats.org/drawingml/2006/picture">
+                  <pic:nvPicPr>
+                    <pic:cNvPr id="1279165604" name=""/>
+                    <pic:cNvPicPr/>
+                  </pic:nvPicPr>
+                  <pic:blipFill>
+                    <a:blip r:embed="rId11"/>
+                    <a:stretch>
+                      <a:fillRect/>
+                    </a:stretch>
+                  </pic:blipFill>
+                  <pic:spPr>
+                    <a:xfrm>
+                      <a:off x="0" y="0"/>
+                      <a:ext cx="2586660" cy="1244143"/>
+                    </a:xfrm>
+                    <a:prstGeom prst="rect">
+                      <a:avLst/>
+                    </a:prstGeom>
+                  </pic:spPr>
+                </pic:pic>
+              </a:graphicData>
+            </a:graphic>
+          </wp:inline>
+        </w:drawing>
+      </w:r>
+      <w:r>
+        <w:rPr>
+          <w:rFonts w:ascii="Times New Roman" w:hAnsi="Times New Roman" w:cs="Times New Roman"/>
+          <w:sz w:val="18"/>
+          <w:szCs w:val="24"/>
+        </w:rPr>
+        <w:drawing>
+          <wp:inline distT="0" distB="0" distL="0" distR="0" wp14:anchorId="18DC938C" wp14:editId="0D7FF36D">
+            <wp:extent cx="2598420" cy="1232659"/>
+            <wp:effectExtent l="0" t="0" r="0" b="5715"/>
+            <wp:docPr id="812016690" name="Picture 1"/>
+            <wp:cNvGraphicFramePr>
+              <a:graphicFrameLocks xmlns:a="http://schemas.openxmlformats.org/drawingml/2006/main" noChangeAspect="1"/>
+            </wp:cNvGraphicFramePr>
+            <a:graphic xmlns:a="http://schemas.openxmlformats.org/drawingml/2006/main">
+              <a:graphicData uri="http://schemas.openxmlformats.org/drawingml/2006/picture">
+                <pic:pic xmlns:pic="http://schemas.openxmlformats.org/drawingml/2006/picture">
+                  <pic:nvPicPr>
+                    <pic:cNvPr id="812016690" name=""/>
+                    <pic:cNvPicPr/>
+                  </pic:nvPicPr>
+                  <pic:blipFill>
+                    <a:blip r:embed="rId12"/>
+                    <a:stretch>
+                      <a:fillRect/>
+                    </a:stretch>
+                  </pic:blipFill>
+                  <pic:spPr>
+                    <a:xfrm>
+                      <a:off x="0" y="0"/>
+                      <a:ext cx="2644946" cy="1254730"/>
+                    </a:xfrm>
+                    <a:prstGeom prst="rect">
+                      <a:avLst/>
+                    </a:prstGeom>
+                  </pic:spPr>
+                </pic:pic>
+              </a:graphicData>
+            </a:graphic>
+          </wp:inline>
+        </w:drawing>
+      </w:r>
+    </w:p>
+    <w:p>
+      <w:pPr>
+        <w:rPr>
+          <w:rFonts w:ascii="Times New Roman" w:hAnsi="Times New Roman" w:cs="Times New Roman"/>
+          <w:sz w:val="18"/>
+          <w:szCs w:val="24"/>
+        </w:rPr>
+      </w:pPr>
+      <w:r>
+        <w:rPr>
+          <w:rFonts w:ascii="Times New Roman" w:hAnsi="Times New Roman" w:cs="Times New Roman"/>
+          <w:sz w:val="18"/>
+          <w:szCs w:val="24"/>
+        </w:rPr>
+        <w:drawing>
+          <wp:inline distT="0" distB="0" distL="0" distR="0" wp14:anchorId="48D48071" wp14:editId="419766C5">
+            <wp:extent cx="2606040" cy="1265125"/>
+            <wp:effectExtent l="0" t="0" r="3810" b="0"/>
+            <wp:docPr id="1692343836" name="Picture 1"/>
+            <wp:cNvGraphicFramePr>
+              <a:graphicFrameLocks xmlns:a="http://schemas.openxmlformats.org/drawingml/2006/main" noChangeAspect="1"/>
+            </wp:cNvGraphicFramePr>
+            <a:graphic xmlns:a="http://schemas.openxmlformats.org/drawingml/2006/main">
+              <a:graphicData uri="http://schemas.openxmlformats.org/drawingml/2006/picture">
+                <pic:pic xmlns:pic="http://schemas.openxmlformats.org/drawingml/2006/picture">
+                  <pic:nvPicPr>
+                    <pic:cNvPr id="1692343836" name=""/>
+                    <pic:cNvPicPr/>
+                  </pic:nvPicPr>
+                  <pic:blipFill>
+                    <a:blip r:embed="rId13"/>
+                    <a:stretch>
+                      <a:fillRect/>
+                    </a:stretch>
+                  </pic:blipFill>
+                  <pic:spPr>
+                    <a:xfrm>
+                      <a:off x="0" y="0"/>
+                      <a:ext cx="2628612" cy="1276083"/>
+                    </a:xfrm>
+                    <a:prstGeom prst="rect">
+                      <a:avLst/>
+                    </a:prstGeom>
+                  </pic:spPr>
+                </pic:pic>
+              </a:graphicData>
+            </a:graphic>
+          </wp:inline>
+        </w:drawing>
+      </w:r>
+      <w:r>
+        <w:rPr>
+          <w:rFonts w:ascii="Times New Roman" w:hAnsi="Times New Roman" w:cs="Times New Roman"/>
+          <w:sz w:val="18"/>
+          <w:szCs w:val="24"/>
+        </w:rPr>
+        <w:drawing>
+          <wp:inline distT="0" distB="0" distL="0" distR="0" wp14:anchorId="565455CD" wp14:editId="4F7193C1">
+            <wp:extent cx="2415540" cy="1251098"/>
+            <wp:effectExtent l="0" t="0" r="3810" b="6350"/>
+            <wp:docPr id="1321211029" name="Picture 1"/>
+            <wp:cNvGraphicFramePr>
+              <a:graphicFrameLocks xmlns:a="http://schemas.openxmlformats.org/drawingml/2006/main" noChangeAspect="1"/>
+            </wp:cNvGraphicFramePr>
+            <a:graphic xmlns:a="http://schemas.openxmlformats.org/drawingml/2006/main">
+              <a:graphicData uri="http://schemas.openxmlformats.org/drawingml/2006/picture">
+                <pic:pic xmlns:pic="http://schemas.openxmlformats.org/drawingml/2006/picture">
+                  <pic:nvPicPr>
+                    <pic:cNvPr id="1321211029" name=""/>
+                    <pic:cNvPicPr/>
+                  </pic:nvPicPr>
+                  <pic:blipFill>
+                    <a:blip r:embed="rId14"/>
+                    <a:stretch>
+                      <a:fillRect/>
+                    </a:stretch>
+                  </pic:blipFill>
+                  <pic:spPr>
+                    <a:xfrm>
+                      <a:off x="0" y="0"/>
+                      <a:ext cx="2434153" cy="1260738"/>
+                    </a:xfrm>
+                    <a:prstGeom prst="rect">
+                      <a:avLst/>
+                    </a:prstGeom>
+                  </pic:spPr>
+                </pic:pic>
+              </a:graphicData>
+            </a:graphic>
+          </wp:inline>
+        </w:drawing>
+      </w:r>
+    </w:p>
+    <w:p>
+      <w:pPr>
+        <w:rPr>
+          <w:rFonts w:ascii="Times New Roman" w:hAnsi="Times New Roman" w:cs="Times New Roman"/>
+          <w:sz w:val="18"/>
+          <w:szCs w:val="24"/>
+        </w:rPr>
+      </w:pPr>
+      <w:r>
+        <w:rPr>
+          <w:rFonts w:ascii="Times New Roman" w:hAnsi="Times New Roman" w:cs="Times New Roman"/>
+          <w:sz w:val="18"/>
+          <w:szCs w:val="24"/>
+        </w:rPr>
+        <w:drawing>
+          <wp:inline distT="0" distB="0" distL="0" distR="0" wp14:anchorId="1154D923" wp14:editId="079BC8E3">
+            <wp:extent cx="2575560" cy="1241788"/>
+            <wp:effectExtent l="0" t="0" r="0" b="0"/>
+            <wp:docPr id="630520942" name="Picture 1"/>
+            <wp:cNvGraphicFramePr>
+              <a:graphicFrameLocks xmlns:a="http://schemas.openxmlformats.org/drawingml/2006/main" noChangeAspect="1"/>
+            </wp:cNvGraphicFramePr>
+            <a:graphic xmlns:a="http://schemas.openxmlformats.org/drawingml/2006/main">
+              <a:graphicData uri="http://schemas.openxmlformats.org/drawingml/2006/picture">
+                <pic:pic xmlns:pic="http://schemas.openxmlformats.org/drawingml/2006/picture">
+                  <pic:nvPicPr>
+                    <pic:cNvPr id="630520942" name=""/>
+                    <pic:cNvPicPr/>
+                  </pic:nvPicPr>
+                  <pic:blipFill>
+                    <a:blip r:embed="rId15"/>
+                    <a:stretch>
+                      <a:fillRect/>
+                    </a:stretch>
+                  </pic:blipFill>
+                  <pic:spPr>
+                    <a:xfrm>
+                      <a:off x="0" y="0"/>
+                      <a:ext cx="2579965" cy="1243912"/>
+                    </a:xfrm>
+                    <a:prstGeom prst="rect">
+                      <a:avLst/>
+                    </a:prstGeom>
+                  </pic:spPr>
+                </pic:pic>
+              </a:graphicData>
+            </a:graphic>
+          </wp:inline>
+        </w:drawing>
+      </w:r>
+    </w:p>
+    <w:p>
+      <w:pPr>
+        <w:rPr>
+          <w:rFonts w:ascii="Times New Roman" w:hAnsi="Times New Roman" w:cs="Times New Roman"/>
+          <w:sz w:val="28"/>
+          <w:szCs w:val="28"/>
+        </w:rPr>
+      </w:pPr>
+    </w:p>
+    <w:p>
+      <w:pPr>
+        <w:rPr>
+          <w:rFonts w:ascii="Times New Roman" w:hAnsi="Times New Roman" w:cs="Times New Roman"/>
+          <w:sz w:val="28"/>
+          <w:szCs w:val="28"/>
+        </w:rPr>
+      </w:pPr>
+      <w:r>
+        <w:rPr>
+          <w:rFonts w:ascii="Times New Roman" w:hAnsi="Times New Roman" w:cs="Times New Roman"/>
+          <w:sz w:val="28"/>
+          <w:szCs w:val="28"/>
+        </w:rPr>
+        <w:lastRenderedPageBreak/>
+        <w:t>Relationships</w:t>
+      </w:r>
+    </w:p>
+    <w:p>
+      <w:pPr>
+        <w:rPr>
+          <w:rFonts w:ascii="Times New Roman" w:hAnsi="Times New Roman" w:cs="Times New Roman"/>
+          <w:sz w:val="18"/>
+          <w:szCs w:val="24"/>
+        </w:rPr>
+      </w:pPr>
+      <w:r>
+        <w:rPr>
+          <w:rFonts w:ascii="Times New Roman" w:hAnsi="Times New Roman" w:cs="Times New Roman"/>
+          <w:sz w:val="18"/>
+          <w:szCs w:val="24"/>
+        </w:rPr>
+        <w:drawing>
+          <wp:inline distT="0" distB="0" distL="0" distR="0" wp14:anchorId="2AE3DCB7" wp14:editId="45A52679">
+            <wp:extent cx="5943600" cy="3452495"/>
+            <wp:effectExtent l="0" t="0" r="0" b="0"/>
+            <wp:docPr id="1206415992" name="Picture 1"/>
+            <wp:cNvGraphicFramePr>
+              <a:graphicFrameLocks xmlns:a="http://schemas.openxmlformats.org/drawingml/2006/main" noChangeAspect="1"/>
+            </wp:cNvGraphicFramePr>
+            <a:graphic xmlns:a="http://schemas.openxmlformats.org/drawingml/2006/main">
+              <a:graphicData uri="http://schemas.openxmlformats.org/drawingml/2006/picture">
+                <pic:pic xmlns:pic="http://schemas.openxmlformats.org/drawingml/2006/picture">
+                  <pic:nvPicPr>
+                    <pic:cNvPr id="1206415992" name=""/>
+                    <pic:cNvPicPr/>
+                  </pic:nvPicPr>
+                  <pic:blipFill>
+                    <a:blip r:embed="rId16"/>
+                    <a:stretch>
+                      <a:fillRect/>
+                    </a:stretch>
+                  </pic:blipFill>
+                  <pic:spPr>
+                    <a:xfrm>
+                      <a:off x="0" y="0"/>
+                      <a:ext cx="5943600" cy="3452495"/>
+                    </a:xfrm>
+                    <a:prstGeom prst="rect">
+                      <a:avLst/>
+                    </a:prstGeom>
+                  </pic:spPr>
+                </pic:pic>
+              </a:graphicData>
+            </a:graphic>
+          </wp:inline>
+        </w:drawing>
+      </w:r>
+    </w:p>
+    <w:p>
+      <w:pPr>
+        <w:rPr>
+          <w:rFonts w:ascii="Times New Roman" w:hAnsi="Times New Roman" w:cs="Times New Roman"/>
+          <w:sz w:val="28"/>
+          <w:szCs w:val="28"/>
+        </w:rPr>
+      </w:pPr>
+      <w:r>
+        <w:rPr>
+          <w:rFonts w:ascii="Times New Roman" w:hAnsi="Times New Roman" w:cs="Times New Roman"/>
+          <w:sz w:val="28"/>
+          <w:szCs w:val="28"/>
+        </w:rPr>
+        <w:t>Explanations of Tables/Data Types</w:t>
+      </w:r>
+    </w:p>
+    <w:p>
+      <w:pPr>
+        <w:rPr>
+          <w:rFonts w:ascii="Times New Roman" w:hAnsi="Times New Roman" w:cs="Times New Roman"/>
+          <w:sz w:val="18"/>
+          <w:szCs w:val="24"/>
+        </w:rPr>
+      </w:pPr>
+      <w:r>
+        <w:rPr>
+          <w:rFonts w:ascii="Times New Roman" w:hAnsi="Times New Roman" w:cs="Times New Roman"/>
+          <w:sz w:val="18"/>
+          <w:szCs w:val="24"/>
+        </w:rPr>
+        <w:t>Customers Database:</w:t>
+      </w:r>
+      <w:r>
+        <w:rPr>
+          <w:rFonts w:ascii="Times New Roman" w:hAnsi="Times New Roman" w:cs="Times New Roman"/>
+          <w:sz w:val="18"/>
+          <w:szCs w:val="24"/>
+        </w:rPr>
+        <w:br/>
+      </w:r>
+      <w:r>
+        <w:rPr>
+          <w:rFonts w:ascii="Times New Roman" w:hAnsi="Times New Roman" w:cs="Times New Roman"/>
+          <w:sz w:val="18"/>
+          <w:szCs w:val="24"/>
+        </w:rPr>
+        <w:drawing>
+          <wp:inline distT="0" distB="0" distL="0" distR="0" wp14:anchorId="4A8AC54D" wp14:editId="7A833240">
+            <wp:extent cx="5943600" cy="1272540"/>
+            <wp:effectExtent l="0" t="0" r="0" b="3810"/>
+            <wp:docPr id="1038511822" name="Picture 1"/>
+            <wp:cNvGraphicFramePr>
+              <a:graphicFrameLocks xmlns:a="http://schemas.openxmlformats.org/drawingml/2006/main" noChangeAspect="1"/>
+            </wp:cNvGraphicFramePr>
+            <a:graphic xmlns:a="http://schemas.openxmlformats.org/drawingml/2006/main">
+              <a:graphicData uri="http://schemas.openxmlformats.org/drawingml/2006/picture">
+                <pic:pic xmlns:pic="http://schemas.openxmlformats.org/drawingml/2006/picture">
+                  <pic:nvPicPr>
+                    <pic:cNvPr id="1038511822" name=""/>
+                    <pic:cNvPicPr/>
+                  </pic:nvPicPr>
+                  <pic:blipFill>
+                    <a:blip r:embed="rId17"/>
+                    <a:stretch>
+                      <a:fillRect/>
+                    </a:stretch>
+                  </pic:blipFill>
+                  <pic:spPr>
+                    <a:xfrm>
+                      <a:off x="0" y="0"/>
+                      <a:ext cx="5943600" cy="1272540"/>
+                    </a:xfrm>
+                    <a:prstGeom prst="rect">
+                      <a:avLst/>
+                    </a:prstGeom>
+                  </pic:spPr>
+                </pic:pic>
+              </a:graphicData>
+            </a:graphic>
+          </wp:inline>
+        </w:drawing>
+      </w:r>
+    </w:p>
+    <w:p>
+      <w:pPr>
+        <w:rPr>
+          <w:rFonts w:ascii="Times New Roman" w:hAnsi="Times New Roman" w:cs="Times New Roman"/>
+          <w:sz w:val="18"/>
+          <w:szCs w:val="24"/>
+        </w:rPr>
+      </w:pPr>
+      <w:r>
+        <w:rPr>
+          <w:rFonts w:ascii="Times New Roman" w:hAnsi="Times New Roman" w:cs="Times New Roman"/>
+          <w:sz w:val="18"/>
+          <w:szCs w:val="24"/>
+        </w:rPr>
+        <w:t>Staffs Database:</w:t>
+      </w:r>
+    </w:p>
+    <w:p>
+      <w:pPr>
+        <w:rPr>
+          <w:rFonts w:ascii="Times New Roman" w:hAnsi="Times New Roman" w:cs="Times New Roman"/>
+          <w:sz w:val="18"/>
+          <w:szCs w:val="24"/>
+        </w:rPr>
+      </w:pPr>
+      <w:r>
+        <w:rPr>
+          <w:rFonts w:ascii="Times New Roman" w:hAnsi="Times New Roman" w:cs="Times New Roman"/>
+          <w:sz w:val="18"/>
+          <w:szCs w:val="24"/>
+        </w:rPr>
+        <w:drawing>
+          <wp:inline distT="0" distB="0" distL="0" distR="0" wp14:anchorId="311F8103" wp14:editId="6D9E4F08">
+            <wp:extent cx="5943600" cy="1226820"/>
+            <wp:effectExtent l="0" t="0" r="0" b="0"/>
+            <wp:docPr id="1198626851" name="Picture 1"/>
+            <wp:cNvGraphicFramePr>
+              <a:graphicFrameLocks xmlns:a="http://schemas.openxmlformats.org/drawingml/2006/main" noChangeAspect="1"/>
+            </wp:cNvGraphicFramePr>
+            <a:graphic xmlns:a="http://schemas.openxmlformats.org/drawingml/2006/main">
+              <a:graphicData uri="http://schemas.openxmlformats.org/drawingml/2006/picture">
+                <pic:pic xmlns:pic="http://schemas.openxmlformats.org/drawingml/2006/picture">
+                  <pic:nvPicPr>
+                    <pic:cNvPr id="1198626851" name=""/>
+                    <pic:cNvPicPr/>
+                  </pic:nvPicPr>
+                  <pic:blipFill>
+                    <a:blip r:embed="rId18"/>
+                    <a:stretch>
+                      <a:fillRect/>
+                    </a:stretch>
+                  </pic:blipFill>
+                  <pic:spPr>
+                    <a:xfrm>
+                      <a:off x="0" y="0"/>
+                      <a:ext cx="5943600" cy="1226820"/>
+                    </a:xfrm>
+                    <a:prstGeom prst="rect">
+                      <a:avLst/>
+                    </a:prstGeom>
+                  </pic:spPr>
+                </pic:pic>
+              </a:graphicData>
+            </a:graphic>
+          </wp:inline>
+        </w:drawing>
+      </w:r>
+    </w:p>
+    <w:p>
+      <w:pPr>
+        <w:rPr>
+          <w:rFonts w:ascii="Times New Roman" w:hAnsi="Times New Roman" w:cs="Times New Roman"/>
+          <w:sz w:val="18"/>
+          <w:szCs w:val="24"/>
+        </w:rPr>
+      </w:pPr>
+      <w:r>
+        <w:rPr>
+          <w:rFonts w:ascii="Times New Roman" w:hAnsi="Times New Roman" w:cs="Times New Roman"/>
+          <w:sz w:val="18"/>
+          <w:szCs w:val="24"/>
+        </w:rPr>
+        <w:t>Stock Database</w:t>
+      </w:r>
+      <w:r>
+        <w:rPr>
+          <w:rFonts w:ascii="Times New Roman" w:hAnsi="Times New Roman" w:cs="Times New Roman"/>
+          <w:sz w:val="18"/>
+          <w:szCs w:val="24"/>
+        </w:rPr>
+        <w:t>:</w:t>
+      </w:r>
+    </w:p>
+    <w:p>
+      <w:pPr>
+        <w:rPr>
+          <w:rFonts w:ascii="Times New Roman" w:hAnsi="Times New Roman" w:cs="Times New Roman"/>
+          <w:sz w:val="18"/>
+          <w:szCs w:val="24"/>
+        </w:rPr>
+      </w:pPr>
+      <w:r>
+        <w:rPr>
+          <w:rFonts w:ascii="Times New Roman" w:hAnsi="Times New Roman" w:cs="Times New Roman"/>
+          <w:sz w:val="18"/>
+          <w:szCs w:val="24"/>
+        </w:rPr>
+        <w:lastRenderedPageBreak/>
+        <w:drawing>
+          <wp:inline distT="0" distB="0" distL="0" distR="0" wp14:anchorId="178008C6" wp14:editId="2F3F9BBB">
+            <wp:extent cx="5943600" cy="1107440"/>
+            <wp:effectExtent l="0" t="0" r="0" b="0"/>
+            <wp:docPr id="1470685979" name="Picture 1"/>
+            <wp:cNvGraphicFramePr>
+              <a:graphicFrameLocks xmlns:a="http://schemas.openxmlformats.org/drawingml/2006/main" noChangeAspect="1"/>
+            </wp:cNvGraphicFramePr>
+            <a:graphic xmlns:a="http://schemas.openxmlformats.org/drawingml/2006/main">
+              <a:graphicData uri="http://schemas.openxmlformats.org/drawingml/2006/picture">
+                <pic:pic xmlns:pic="http://schemas.openxmlformats.org/drawingml/2006/picture">
+                  <pic:nvPicPr>
+                    <pic:cNvPr id="1470685979" name=""/>
+                    <pic:cNvPicPr/>
+                  </pic:nvPicPr>
+                  <pic:blipFill>
+                    <a:blip r:embed="rId19"/>
+                    <a:stretch>
+                      <a:fillRect/>
+                    </a:stretch>
+                  </pic:blipFill>
+                  <pic:spPr>
+                    <a:xfrm>
+                      <a:off x="0" y="0"/>
+                      <a:ext cx="5943600" cy="1107440"/>
+                    </a:xfrm>
+                    <a:prstGeom prst="rect">
+                      <a:avLst/>
+                    </a:prstGeom>
+                  </pic:spPr>
+                </pic:pic>
+              </a:graphicData>
+            </a:graphic>
+          </wp:inline>
+        </w:drawing>
+      </w:r>
+    </w:p>
+    <w:p>
+      <w:pPr>
+        <w:rPr>
+          <w:rFonts w:ascii="Times New Roman" w:hAnsi="Times New Roman" w:cs="Times New Roman"/>
+          <w:sz w:val="18"/>
+          <w:szCs w:val="24"/>
+        </w:rPr>
+      </w:pPr>
+      <w:r>
+        <w:rPr>
+          <w:rFonts w:ascii="Times New Roman" w:hAnsi="Times New Roman" w:cs="Times New Roman"/>
+          <w:sz w:val="18"/>
+          <w:szCs w:val="24"/>
+        </w:rPr>
+        <w:t>Order Items Database:</w:t>
+      </w:r>
+    </w:p>
+    <w:p>
+      <w:pPr>
+        <w:rPr>
+          <w:rFonts w:ascii="Times New Roman" w:hAnsi="Times New Roman" w:cs="Times New Roman"/>
+          <w:sz w:val="18"/>
+          <w:szCs w:val="24"/>
+        </w:rPr>
+      </w:pPr>
+      <w:r>
+        <w:rPr>
+          <w:rFonts w:ascii="Times New Roman" w:hAnsi="Times New Roman" w:cs="Times New Roman"/>
+          <w:sz w:val="18"/>
+          <w:szCs w:val="24"/>
+        </w:rPr>
+        <w:drawing>
+          <wp:inline distT="0" distB="0" distL="0" distR="0" wp14:anchorId="3A859498" wp14:editId="33A6E12B">
+            <wp:extent cx="5943600" cy="942975"/>
+            <wp:effectExtent l="0" t="0" r="0" b="9525"/>
+            <wp:docPr id="21445261" name="Picture 1"/>
+            <wp:cNvGraphicFramePr>
+              <a:graphicFrameLocks xmlns:a="http://schemas.openxmlformats.org/drawingml/2006/main" noChangeAspect="1"/>
+            </wp:cNvGraphicFramePr>
+            <a:graphic xmlns:a="http://schemas.openxmlformats.org/drawingml/2006/main">
+              <a:graphicData uri="http://schemas.openxmlformats.org/drawingml/2006/picture">
+                <pic:pic xmlns:pic="http://schemas.openxmlformats.org/drawingml/2006/picture">
+                  <pic:nvPicPr>
+                    <pic:cNvPr id="21445261" name=""/>
+                    <pic:cNvPicPr/>
+                  </pic:nvPicPr>
+                  <pic:blipFill>
+                    <a:blip r:embed="rId20"/>
+                    <a:stretch>
+                      <a:fillRect/>
+                    </a:stretch>
+                  </pic:blipFill>
+                  <pic:spPr>
+                    <a:xfrm>
+                      <a:off x="0" y="0"/>
+                      <a:ext cx="5943600" cy="942975"/>
+                    </a:xfrm>
+                    <a:prstGeom prst="rect">
+                      <a:avLst/>
+                    </a:prstGeom>
+                  </pic:spPr>
+                </pic:pic>
+              </a:graphicData>
+            </a:graphic>
+          </wp:inline>
+        </w:drawing>
+      </w:r>
+    </w:p>
+    <w:p>
+      <w:pPr>
+        <w:rPr>
+          <w:rFonts w:ascii="Times New Roman" w:hAnsi="Times New Roman" w:cs="Times New Roman"/>
+          <w:sz w:val="18"/>
+          <w:szCs w:val="24"/>
+        </w:rPr>
+      </w:pPr>
+      <w:r>
+        <w:rPr>
+          <w:rFonts w:ascii="Times New Roman" w:hAnsi="Times New Roman" w:cs="Times New Roman"/>
+          <w:sz w:val="18"/>
+          <w:szCs w:val="24"/>
+        </w:rPr>
+        <w:t>Orders:</w:t>
+      </w:r>
+    </w:p>
+    <w:p>
+      <w:pPr>
+        <w:rPr>
+          <w:rFonts w:ascii="Times New Roman" w:hAnsi="Times New Roman" w:cs="Times New Roman"/>
+          <w:sz w:val="18"/>
+          <w:szCs w:val="24"/>
+        </w:rPr>
+      </w:pPr>
+      <w:r>
+        <w:rPr>
+          <w:rFonts w:ascii="Times New Roman" w:hAnsi="Times New Roman" w:cs="Times New Roman"/>
+          <w:sz w:val="18"/>
+          <w:szCs w:val="24"/>
+        </w:rPr>
+        <w:drawing>
+          <wp:inline distT="0" distB="0" distL="0" distR="0" wp14:anchorId="1DC6E2BB" wp14:editId="22CEA565">
+            <wp:extent cx="5943600" cy="927100"/>
+            <wp:effectExtent l="0" t="0" r="0" b="6350"/>
+            <wp:docPr id="304475857" name="Picture 1"/>
+            <wp:cNvGraphicFramePr>
+              <a:graphicFrameLocks xmlns:a="http://schemas.openxmlformats.org/drawingml/2006/main" noChangeAspect="1"/>
+            </wp:cNvGraphicFramePr>
+            <a:graphic xmlns:a="http://schemas.openxmlformats.org/drawingml/2006/main">
+              <a:graphicData uri="http://schemas.openxmlformats.org/drawingml/2006/picture">
+                <pic:pic xmlns:pic="http://schemas.openxmlformats.org/drawingml/2006/picture">
+                  <pic:nvPicPr>
+                    <pic:cNvPr id="304475857" name=""/>
+                    <pic:cNvPicPr/>
+                  </pic:nvPicPr>
+                  <pic:blipFill>
+                    <a:blip r:embed="rId21"/>
+                    <a:stretch>
+                      <a:fillRect/>
+                    </a:stretch>
+                  </pic:blipFill>
+                  <pic:spPr>
+                    <a:xfrm>
+                      <a:off x="0" y="0"/>
+                      <a:ext cx="5943600" cy="927100"/>
+                    </a:xfrm>
+                    <a:prstGeom prst="rect">
+                      <a:avLst/>
+                    </a:prstGeom>
+                  </pic:spPr>
+                </pic:pic>
+              </a:graphicData>
+            </a:graphic>
+          </wp:inline>
+        </w:drawing>
+      </w:r>
+    </w:p>
+    <w:p>
+      <w:pPr>
+        <w:rPr>
+          <w:rFonts w:ascii="Times New Roman" w:hAnsi="Times New Roman" w:cs="Times New Roman"/>
           <w:sz w:val="18"/>
           <w:szCs w:val="24"/>
         </w:rPr>
@@ -3431,7 +4128,7 @@
                 <w:sz w:val="20"/>
                 <w:szCs w:val="20"/>
               </w:rPr>
-              <w:t xml:space="preserve">Enter Data in Loan Table about a Device Lend to a Student Who Does </w:t>
+              <w:t xml:space="preserve">Enter Data in Loan Table about a Device Lend to a Student </w:t>
             </w:r>
             <w:r>
               <w:rPr>
@@ -3440,7 +4137,7 @@
                 <w:szCs w:val="20"/>
               </w:rPr>
               <w:lastRenderedPageBreak/>
-              <w:t>Not Exist in Student Table</w:t>
+              <w:t>Who Does Not Exist in Student Table</w:t>
             </w:r>
           </w:p>
         </w:tc>
@@ -3539,7 +4236,16 @@
                 <w:sz w:val="20"/>
                 <w:szCs w:val="20"/>
               </w:rPr>
-              <w:t>Relationship between Load and Student Table is Working Correctly</w:t>
+              <w:t xml:space="preserve">Relationship between Load and Student Table is </w:t>
+            </w:r>
+            <w:r>
+              <w:rPr>
+                <w:rFonts w:ascii="Times New Roman" w:hAnsi="Times New Roman" w:cs="Times New Roman"/>
+                <w:sz w:val="20"/>
+                <w:szCs w:val="20"/>
+              </w:rPr>
+              <w:lastRenderedPageBreak/>
+              <w:t>Working Correctly</w:t>
             </w:r>
           </w:p>
         </w:tc>
@@ -3568,6 +4274,7 @@
                 <w:sz w:val="20"/>
                 <w:szCs w:val="20"/>
               </w:rPr>
+              <w:lastRenderedPageBreak/>
               <w:t>7</w:t>
             </w:r>
           </w:p>

</xml_diff>

<commit_message>
Added a bunch of queries for different things
</commit_message>
<xml_diff>
--- a/L2DTS - 91892 Database Visual Diary.docx
+++ b/L2DTS - 91892 Database Visual Diary.docx
@@ -344,25 +344,7 @@
                 <w:sz w:val="20"/>
                 <w:szCs w:val="20"/>
               </w:rPr>
-              <w:t xml:space="preserve">Linking data </w:t>
-            </w:r>
-            <w:proofErr w:type="gramStart"/>
-            <w:r>
-              <w:rPr>
-                <w:rFonts w:ascii="Times New Roman" w:hAnsi="Times New Roman" w:cs="Times New Roman"/>
-                <w:sz w:val="20"/>
-                <w:szCs w:val="20"/>
-              </w:rPr>
-              <w:t>in</w:t>
-            </w:r>
-            <w:proofErr w:type="gramEnd"/>
-            <w:r>
-              <w:rPr>
-                <w:rFonts w:ascii="Times New Roman" w:hAnsi="Times New Roman" w:cs="Times New Roman"/>
-                <w:sz w:val="20"/>
-                <w:szCs w:val="20"/>
-              </w:rPr>
-              <w:t xml:space="preserve"> related tables or nodes using queries or keys</w:t>
+              <w:t>Linking data in related tables or nodes using queries or keys</w:t>
             </w:r>
           </w:p>
         </w:tc>
@@ -491,23 +473,13 @@
                 <w:szCs w:val="20"/>
               </w:rPr>
             </w:pPr>
-            <w:proofErr w:type="spellStart"/>
-            <w:r>
-              <w:rPr>
-                <w:rFonts w:ascii="Times New Roman" w:hAnsi="Times New Roman" w:cs="Times New Roman"/>
-                <w:sz w:val="20"/>
-                <w:szCs w:val="20"/>
-              </w:rPr>
-              <w:t>Customising</w:t>
-            </w:r>
-            <w:proofErr w:type="spellEnd"/>
-            <w:r>
-              <w:rPr>
-                <w:rFonts w:ascii="Times New Roman" w:hAnsi="Times New Roman" w:cs="Times New Roman"/>
-                <w:sz w:val="20"/>
-                <w:szCs w:val="20"/>
-              </w:rPr>
-              <w:t xml:space="preserve"> presentation of the data</w:t>
+            <w:r>
+              <w:rPr>
+                <w:rFonts w:ascii="Times New Roman" w:hAnsi="Times New Roman" w:cs="Times New Roman"/>
+                <w:sz w:val="20"/>
+                <w:szCs w:val="20"/>
+              </w:rPr>
+              <w:t>Customising presentation of the data</w:t>
             </w:r>
           </w:p>
         </w:tc>
@@ -733,6 +705,14 @@
                 <w:szCs w:val="24"/>
               </w:rPr>
             </w:pPr>
+            <w:r>
+              <w:rPr>
+                <w:rFonts w:ascii="Times New Roman" w:hAnsi="Times New Roman" w:cs="Times New Roman"/>
+                <w:sz w:val="24"/>
+                <w:szCs w:val="24"/>
+              </w:rPr>
+              <w:t>I started my logo with a simple design with just text</w:t>
+            </w:r>
           </w:p>
         </w:tc>
       </w:tr>
@@ -806,6 +786,22 @@
                 <w:szCs w:val="24"/>
               </w:rPr>
             </w:pPr>
+            <w:r>
+              <w:rPr>
+                <w:rFonts w:ascii="Times New Roman" w:hAnsi="Times New Roman" w:cs="Times New Roman"/>
+                <w:sz w:val="24"/>
+                <w:szCs w:val="24"/>
+              </w:rPr>
+              <w:t xml:space="preserve">But I did not like how the text was arranged as I felt it was too long, so I </w:t>
+            </w:r>
+            <w:r>
+              <w:rPr>
+                <w:rFonts w:ascii="Times New Roman" w:hAnsi="Times New Roman" w:cs="Times New Roman"/>
+                <w:sz w:val="24"/>
+                <w:szCs w:val="24"/>
+              </w:rPr>
+              <w:t>rearranged it to be one word above the other</w:t>
+            </w:r>
           </w:p>
         </w:tc>
       </w:tr>
@@ -879,6 +875,22 @@
                 <w:szCs w:val="24"/>
               </w:rPr>
             </w:pPr>
+            <w:r>
+              <w:rPr>
+                <w:rFonts w:ascii="Times New Roman" w:hAnsi="Times New Roman" w:cs="Times New Roman"/>
+                <w:sz w:val="24"/>
+                <w:szCs w:val="24"/>
+              </w:rPr>
+              <w:t xml:space="preserve">Then I decided that I wanted an icon that represented my business, so I traced a cow head </w:t>
+            </w:r>
+            <w:r>
+              <w:rPr>
+                <w:rFonts w:ascii="Times New Roman" w:hAnsi="Times New Roman" w:cs="Times New Roman"/>
+                <w:sz w:val="24"/>
+                <w:szCs w:val="24"/>
+              </w:rPr>
+              <w:t>as my business is about Biltong which comes from cows</w:t>
+            </w:r>
           </w:p>
         </w:tc>
       </w:tr>
@@ -952,6 +964,22 @@
                 <w:szCs w:val="24"/>
               </w:rPr>
             </w:pPr>
+            <w:r>
+              <w:rPr>
+                <w:rFonts w:ascii="Times New Roman" w:hAnsi="Times New Roman" w:cs="Times New Roman"/>
+                <w:sz w:val="24"/>
+                <w:szCs w:val="24"/>
+              </w:rPr>
+              <w:t>But I thought it looked a bit plain, so I decided to put a background on it</w:t>
+            </w:r>
+            <w:r>
+              <w:rPr>
+                <w:rFonts w:ascii="Times New Roman" w:hAnsi="Times New Roman" w:cs="Times New Roman"/>
+                <w:sz w:val="24"/>
+                <w:szCs w:val="24"/>
+              </w:rPr>
+              <w:t xml:space="preserve"> and decided with this brown colour</w:t>
+            </w:r>
           </w:p>
         </w:tc>
       </w:tr>
@@ -1038,6 +1066,7 @@
           <w:sz w:val="24"/>
           <w:szCs w:val="24"/>
         </w:rPr>
+        <w:lastRenderedPageBreak/>
         <w:t>Staff Table</w:t>
       </w:r>
     </w:p>
@@ -1055,7 +1084,6 @@
           <w:sz w:val="24"/>
           <w:szCs w:val="24"/>
         </w:rPr>
-        <w:lastRenderedPageBreak/>
         <w:t>Customers Table</w:t>
       </w:r>
     </w:p>
@@ -1154,6 +1182,7 @@
       <w:r>
         <w:rPr>
           <w:rFonts w:ascii="Times New Roman" w:hAnsi="Times New Roman" w:cs="Times New Roman"/>
+          <w:noProof/>
           <w:sz w:val="24"/>
           <w:szCs w:val="24"/>
         </w:rPr>
@@ -1324,6 +1353,7 @@
       <w:r>
         <w:rPr>
           <w:rFonts w:ascii="Times New Roman" w:hAnsi="Times New Roman" w:cs="Times New Roman"/>
+          <w:noProof/>
           <w:sz w:val="18"/>
           <w:szCs w:val="24"/>
         </w:rPr>
@@ -1366,6 +1396,7 @@
       <w:r>
         <w:rPr>
           <w:rFonts w:ascii="Times New Roman" w:hAnsi="Times New Roman" w:cs="Times New Roman"/>
+          <w:noProof/>
           <w:sz w:val="18"/>
           <w:szCs w:val="24"/>
         </w:rPr>
@@ -1417,6 +1448,7 @@
       <w:r>
         <w:rPr>
           <w:rFonts w:ascii="Times New Roman" w:hAnsi="Times New Roman" w:cs="Times New Roman"/>
+          <w:noProof/>
           <w:sz w:val="18"/>
           <w:szCs w:val="24"/>
         </w:rPr>
@@ -1459,6 +1491,7 @@
       <w:r>
         <w:rPr>
           <w:rFonts w:ascii="Times New Roman" w:hAnsi="Times New Roman" w:cs="Times New Roman"/>
+          <w:noProof/>
           <w:sz w:val="18"/>
           <w:szCs w:val="24"/>
         </w:rPr>
@@ -1510,6 +1543,7 @@
       <w:r>
         <w:rPr>
           <w:rFonts w:ascii="Times New Roman" w:hAnsi="Times New Roman" w:cs="Times New Roman"/>
+          <w:noProof/>
           <w:sz w:val="18"/>
           <w:szCs w:val="24"/>
         </w:rPr>
@@ -1588,6 +1622,7 @@
       <w:r>
         <w:rPr>
           <w:rFonts w:ascii="Times New Roman" w:hAnsi="Times New Roman" w:cs="Times New Roman"/>
+          <w:noProof/>
           <w:sz w:val="18"/>
           <w:szCs w:val="24"/>
         </w:rPr>
@@ -1672,6 +1707,7 @@
       <w:r>
         <w:rPr>
           <w:rFonts w:ascii="Times New Roman" w:hAnsi="Times New Roman" w:cs="Times New Roman"/>
+          <w:noProof/>
           <w:sz w:val="18"/>
           <w:szCs w:val="24"/>
         </w:rPr>
@@ -1740,6 +1776,7 @@
       <w:r>
         <w:rPr>
           <w:rFonts w:ascii="Times New Roman" w:hAnsi="Times New Roman" w:cs="Times New Roman"/>
+          <w:noProof/>
           <w:sz w:val="18"/>
           <w:szCs w:val="24"/>
         </w:rPr>
@@ -1816,6 +1853,7 @@
       <w:r>
         <w:rPr>
           <w:rFonts w:ascii="Times New Roman" w:hAnsi="Times New Roman" w:cs="Times New Roman"/>
+          <w:noProof/>
           <w:sz w:val="18"/>
           <w:szCs w:val="24"/>
         </w:rPr>
@@ -1885,6 +1923,7 @@
       <w:r>
         <w:rPr>
           <w:rFonts w:ascii="Times New Roman" w:hAnsi="Times New Roman" w:cs="Times New Roman"/>
+          <w:noProof/>
           <w:sz w:val="18"/>
           <w:szCs w:val="24"/>
         </w:rPr>
@@ -1953,6 +1992,7 @@
       <w:r>
         <w:rPr>
           <w:rFonts w:ascii="Times New Roman" w:hAnsi="Times New Roman" w:cs="Times New Roman"/>
+          <w:noProof/>
           <w:sz w:val="18"/>
           <w:szCs w:val="24"/>
         </w:rPr>
@@ -2547,7 +2587,6 @@
                 <w:szCs w:val="24"/>
               </w:rPr>
             </w:pPr>
-            <w:proofErr w:type="gramStart"/>
             <w:r>
               <w:rPr>
                 <w:rFonts w:ascii="Times New Roman" w:hAnsi="Times New Roman" w:cs="Times New Roman"/>
@@ -2557,7 +2596,6 @@
               </w:rPr>
               <w:t>Address Relevant Implication</w:t>
             </w:r>
-            <w:proofErr w:type="gramEnd"/>
             <w:r>
               <w:rPr>
                 <w:rFonts w:ascii="Times New Roman" w:hAnsi="Times New Roman" w:cs="Times New Roman"/>
@@ -3548,23 +3586,13 @@
                 <w:szCs w:val="20"/>
               </w:rPr>
             </w:pPr>
-            <w:proofErr w:type="gramStart"/>
-            <w:r>
-              <w:rPr>
-                <w:rFonts w:ascii="Times New Roman" w:hAnsi="Times New Roman" w:cs="Times New Roman"/>
-                <w:sz w:val="20"/>
-                <w:szCs w:val="20"/>
-              </w:rPr>
-              <w:t>Enter</w:t>
-            </w:r>
-            <w:proofErr w:type="gramEnd"/>
-            <w:r>
-              <w:rPr>
-                <w:rFonts w:ascii="Times New Roman" w:hAnsi="Times New Roman" w:cs="Times New Roman"/>
-                <w:sz w:val="20"/>
-                <w:szCs w:val="20"/>
-              </w:rPr>
-              <w:t xml:space="preserve"> Alphabets in Age Field</w:t>
+            <w:r>
+              <w:rPr>
+                <w:rFonts w:ascii="Times New Roman" w:hAnsi="Times New Roman" w:cs="Times New Roman"/>
+                <w:sz w:val="20"/>
+                <w:szCs w:val="20"/>
+              </w:rPr>
+              <w:t>Enter Alphabets in Age Field</w:t>
             </w:r>
           </w:p>
         </w:tc>
@@ -5225,25 +5253,7 @@
           <w:sz w:val="18"/>
           <w:szCs w:val="24"/>
         </w:rPr>
-        <w:t xml:space="preserve">Make sure to record iterative improvement in the </w:t>
-      </w:r>
-      <w:proofErr w:type="gramStart"/>
-      <w:r>
-        <w:rPr>
-          <w:rFonts w:ascii="Times New Roman" w:hAnsi="Times New Roman" w:cs="Times New Roman"/>
-          <w:sz w:val="18"/>
-          <w:szCs w:val="24"/>
-        </w:rPr>
-        <w:t>below table</w:t>
-      </w:r>
-      <w:proofErr w:type="gramEnd"/>
-      <w:r>
-        <w:rPr>
-          <w:rFonts w:ascii="Times New Roman" w:hAnsi="Times New Roman" w:cs="Times New Roman"/>
-          <w:sz w:val="18"/>
-          <w:szCs w:val="24"/>
-        </w:rPr>
-        <w:t xml:space="preserve"> as well as video evidence.)</w:t>
+        <w:t>Make sure to record iterative improvement in the below table as well as video evidence.)</w:t>
       </w:r>
     </w:p>
     <w:p>
@@ -5280,27 +5290,7 @@
           <w:sz w:val="18"/>
           <w:szCs w:val="24"/>
         </w:rPr>
-        <w:t xml:space="preserve"> </w:t>
-      </w:r>
-      <w:proofErr w:type="gramStart"/>
-      <w:r>
-        <w:rPr>
-          <w:rFonts w:ascii="Times New Roman" w:hAnsi="Times New Roman" w:cs="Times New Roman"/>
-          <w:color w:val="FF0000"/>
-          <w:sz w:val="18"/>
-          <w:szCs w:val="24"/>
-        </w:rPr>
-        <w:t>is</w:t>
-      </w:r>
-      <w:proofErr w:type="gramEnd"/>
-      <w:r>
-        <w:rPr>
-          <w:rFonts w:ascii="Times New Roman" w:hAnsi="Times New Roman" w:cs="Times New Roman"/>
-          <w:color w:val="FF0000"/>
-          <w:sz w:val="18"/>
-          <w:szCs w:val="24"/>
-        </w:rPr>
-        <w:t xml:space="preserve"> required throughout the design, development and testing process.</w:t>
+        <w:t xml:space="preserve"> is required throughout the design, development and testing process.</w:t>
       </w:r>
     </w:p>
     <w:tbl>
@@ -6017,25 +6007,7 @@
           <w:sz w:val="18"/>
           <w:szCs w:val="24"/>
         </w:rPr>
-        <w:t xml:space="preserve"> show how queries, forms, sorting, and field </w:t>
-      </w:r>
-      <w:proofErr w:type="spellStart"/>
-      <w:r>
-        <w:rPr>
-          <w:rFonts w:ascii="Times New Roman" w:hAnsi="Times New Roman" w:cs="Times New Roman"/>
-          <w:sz w:val="18"/>
-          <w:szCs w:val="24"/>
-        </w:rPr>
-        <w:t>organisation</w:t>
-      </w:r>
-      <w:proofErr w:type="spellEnd"/>
-      <w:r>
-        <w:rPr>
-          <w:rFonts w:ascii="Times New Roman" w:hAnsi="Times New Roman" w:cs="Times New Roman"/>
-          <w:sz w:val="18"/>
-          <w:szCs w:val="24"/>
-        </w:rPr>
-        <w:t xml:space="preserve"> help users easily enter data and retrieve the information they need.)</w:t>
+        <w:t xml:space="preserve"> show how queries, forms, sorting, and field organisation help users easily enter data and retrieve the information they need.)</w:t>
       </w:r>
     </w:p>
     <w:sectPr>

</xml_diff>

<commit_message>
Updated and added queries
</commit_message>
<xml_diff>
--- a/L2DTS - 91892 Database Visual Diary.docx
+++ b/L2DTS - 91892 Database Visual Diary.docx
@@ -344,7 +344,25 @@
                 <w:sz w:val="20"/>
                 <w:szCs w:val="20"/>
               </w:rPr>
-              <w:t>Linking data in related tables or nodes using queries or keys</w:t>
+              <w:t xml:space="preserve">Linking data </w:t>
+            </w:r>
+            <w:proofErr w:type="gramStart"/>
+            <w:r>
+              <w:rPr>
+                <w:rFonts w:ascii="Times New Roman" w:hAnsi="Times New Roman" w:cs="Times New Roman"/>
+                <w:sz w:val="20"/>
+                <w:szCs w:val="20"/>
+              </w:rPr>
+              <w:t>in</w:t>
+            </w:r>
+            <w:proofErr w:type="gramEnd"/>
+            <w:r>
+              <w:rPr>
+                <w:rFonts w:ascii="Times New Roman" w:hAnsi="Times New Roman" w:cs="Times New Roman"/>
+                <w:sz w:val="20"/>
+                <w:szCs w:val="20"/>
+              </w:rPr>
+              <w:t xml:space="preserve"> related tables or nodes using queries or keys</w:t>
             </w:r>
           </w:p>
         </w:tc>
@@ -473,13 +491,23 @@
                 <w:szCs w:val="20"/>
               </w:rPr>
             </w:pPr>
-            <w:r>
-              <w:rPr>
-                <w:rFonts w:ascii="Times New Roman" w:hAnsi="Times New Roman" w:cs="Times New Roman"/>
-                <w:sz w:val="20"/>
-                <w:szCs w:val="20"/>
-              </w:rPr>
-              <w:t>Customising presentation of the data</w:t>
+            <w:proofErr w:type="spellStart"/>
+            <w:r>
+              <w:rPr>
+                <w:rFonts w:ascii="Times New Roman" w:hAnsi="Times New Roman" w:cs="Times New Roman"/>
+                <w:sz w:val="20"/>
+                <w:szCs w:val="20"/>
+              </w:rPr>
+              <w:t>Customising</w:t>
+            </w:r>
+            <w:proofErr w:type="spellEnd"/>
+            <w:r>
+              <w:rPr>
+                <w:rFonts w:ascii="Times New Roman" w:hAnsi="Times New Roman" w:cs="Times New Roman"/>
+                <w:sz w:val="20"/>
+                <w:szCs w:val="20"/>
+              </w:rPr>
+              <w:t xml:space="preserve"> presentation of the data</w:t>
             </w:r>
           </w:p>
         </w:tc>
@@ -2090,6 +2118,407 @@
           <w:szCs w:val="24"/>
         </w:rPr>
       </w:pPr>
+      <w:r>
+        <w:rPr>
+          <w:rFonts w:ascii="Times New Roman" w:hAnsi="Times New Roman" w:cs="Times New Roman"/>
+          <w:sz w:val="24"/>
+          <w:szCs w:val="24"/>
+        </w:rPr>
+        <w:drawing>
+          <wp:inline distT="0" distB="0" distL="0" distR="0" wp14:anchorId="1B97746D" wp14:editId="390C7F3A">
+            <wp:extent cx="5943600" cy="3063875"/>
+            <wp:effectExtent l="0" t="0" r="0" b="3175"/>
+            <wp:docPr id="856577810" name="Picture 1"/>
+            <wp:cNvGraphicFramePr>
+              <a:graphicFrameLocks xmlns:a="http://schemas.openxmlformats.org/drawingml/2006/main" noChangeAspect="1"/>
+            </wp:cNvGraphicFramePr>
+            <a:graphic xmlns:a="http://schemas.openxmlformats.org/drawingml/2006/main">
+              <a:graphicData uri="http://schemas.openxmlformats.org/drawingml/2006/picture">
+                <pic:pic xmlns:pic="http://schemas.openxmlformats.org/drawingml/2006/picture">
+                  <pic:nvPicPr>
+                    <pic:cNvPr id="856577810" name=""/>
+                    <pic:cNvPicPr/>
+                  </pic:nvPicPr>
+                  <pic:blipFill>
+                    <a:blip r:embed="rId22"/>
+                    <a:stretch>
+                      <a:fillRect/>
+                    </a:stretch>
+                  </pic:blipFill>
+                  <pic:spPr>
+                    <a:xfrm>
+                      <a:off x="0" y="0"/>
+                      <a:ext cx="5943600" cy="3063875"/>
+                    </a:xfrm>
+                    <a:prstGeom prst="rect">
+                      <a:avLst/>
+                    </a:prstGeom>
+                  </pic:spPr>
+                </pic:pic>
+              </a:graphicData>
+            </a:graphic>
+          </wp:inline>
+        </w:drawing>
+      </w:r>
+    </w:p>
+    <w:p>
+      <w:pPr>
+        <w:rPr>
+          <w:rFonts w:ascii="Times New Roman" w:hAnsi="Times New Roman" w:cs="Times New Roman"/>
+          <w:sz w:val="24"/>
+          <w:szCs w:val="24"/>
+        </w:rPr>
+      </w:pPr>
+      <w:r>
+        <w:rPr>
+          <w:rFonts w:ascii="Times New Roman" w:hAnsi="Times New Roman" w:cs="Times New Roman"/>
+          <w:sz w:val="24"/>
+          <w:szCs w:val="24"/>
+        </w:rPr>
+        <w:lastRenderedPageBreak/>
+        <w:drawing>
+          <wp:inline distT="0" distB="0" distL="0" distR="0" wp14:anchorId="00B503EB" wp14:editId="458D711C">
+            <wp:extent cx="5943600" cy="2863850"/>
+            <wp:effectExtent l="0" t="0" r="0" b="0"/>
+            <wp:docPr id="1577551565" name="Picture 1"/>
+            <wp:cNvGraphicFramePr>
+              <a:graphicFrameLocks xmlns:a="http://schemas.openxmlformats.org/drawingml/2006/main" noChangeAspect="1"/>
+            </wp:cNvGraphicFramePr>
+            <a:graphic xmlns:a="http://schemas.openxmlformats.org/drawingml/2006/main">
+              <a:graphicData uri="http://schemas.openxmlformats.org/drawingml/2006/picture">
+                <pic:pic xmlns:pic="http://schemas.openxmlformats.org/drawingml/2006/picture">
+                  <pic:nvPicPr>
+                    <pic:cNvPr id="1577551565" name=""/>
+                    <pic:cNvPicPr/>
+                  </pic:nvPicPr>
+                  <pic:blipFill>
+                    <a:blip r:embed="rId23"/>
+                    <a:stretch>
+                      <a:fillRect/>
+                    </a:stretch>
+                  </pic:blipFill>
+                  <pic:spPr>
+                    <a:xfrm>
+                      <a:off x="0" y="0"/>
+                      <a:ext cx="5943600" cy="2863850"/>
+                    </a:xfrm>
+                    <a:prstGeom prst="rect">
+                      <a:avLst/>
+                    </a:prstGeom>
+                  </pic:spPr>
+                </pic:pic>
+              </a:graphicData>
+            </a:graphic>
+          </wp:inline>
+        </w:drawing>
+      </w:r>
+    </w:p>
+    <w:p>
+      <w:pPr>
+        <w:rPr>
+          <w:rFonts w:ascii="Times New Roman" w:hAnsi="Times New Roman" w:cs="Times New Roman"/>
+          <w:sz w:val="24"/>
+          <w:szCs w:val="24"/>
+        </w:rPr>
+      </w:pPr>
+      <w:r>
+        <w:rPr>
+          <w:rFonts w:ascii="Times New Roman" w:hAnsi="Times New Roman" w:cs="Times New Roman"/>
+          <w:sz w:val="24"/>
+          <w:szCs w:val="24"/>
+        </w:rPr>
+        <w:drawing>
+          <wp:inline distT="0" distB="0" distL="0" distR="0" wp14:anchorId="5EA50AA1" wp14:editId="3A6C9F8E">
+            <wp:extent cx="5943600" cy="2877185"/>
+            <wp:effectExtent l="0" t="0" r="0" b="0"/>
+            <wp:docPr id="1191352684" name="Picture 1"/>
+            <wp:cNvGraphicFramePr>
+              <a:graphicFrameLocks xmlns:a="http://schemas.openxmlformats.org/drawingml/2006/main" noChangeAspect="1"/>
+            </wp:cNvGraphicFramePr>
+            <a:graphic xmlns:a="http://schemas.openxmlformats.org/drawingml/2006/main">
+              <a:graphicData uri="http://schemas.openxmlformats.org/drawingml/2006/picture">
+                <pic:pic xmlns:pic="http://schemas.openxmlformats.org/drawingml/2006/picture">
+                  <pic:nvPicPr>
+                    <pic:cNvPr id="1191352684" name=""/>
+                    <pic:cNvPicPr/>
+                  </pic:nvPicPr>
+                  <pic:blipFill>
+                    <a:blip r:embed="rId24"/>
+                    <a:stretch>
+                      <a:fillRect/>
+                    </a:stretch>
+                  </pic:blipFill>
+                  <pic:spPr>
+                    <a:xfrm>
+                      <a:off x="0" y="0"/>
+                      <a:ext cx="5943600" cy="2877185"/>
+                    </a:xfrm>
+                    <a:prstGeom prst="rect">
+                      <a:avLst/>
+                    </a:prstGeom>
+                  </pic:spPr>
+                </pic:pic>
+              </a:graphicData>
+            </a:graphic>
+          </wp:inline>
+        </w:drawing>
+      </w:r>
+    </w:p>
+    <w:p>
+      <w:pPr>
+        <w:rPr>
+          <w:rFonts w:ascii="Times New Roman" w:hAnsi="Times New Roman" w:cs="Times New Roman"/>
+          <w:sz w:val="24"/>
+          <w:szCs w:val="24"/>
+        </w:rPr>
+      </w:pPr>
+      <w:r>
+        <w:rPr>
+          <w:rFonts w:ascii="Times New Roman" w:hAnsi="Times New Roman" w:cs="Times New Roman"/>
+          <w:sz w:val="24"/>
+          <w:szCs w:val="24"/>
+        </w:rPr>
+        <w:lastRenderedPageBreak/>
+        <w:drawing>
+          <wp:inline distT="0" distB="0" distL="0" distR="0" wp14:anchorId="7D462FC2" wp14:editId="1EF6F4C9">
+            <wp:extent cx="5943600" cy="2658110"/>
+            <wp:effectExtent l="0" t="0" r="0" b="8890"/>
+            <wp:docPr id="2073707413" name="Picture 1"/>
+            <wp:cNvGraphicFramePr>
+              <a:graphicFrameLocks xmlns:a="http://schemas.openxmlformats.org/drawingml/2006/main" noChangeAspect="1"/>
+            </wp:cNvGraphicFramePr>
+            <a:graphic xmlns:a="http://schemas.openxmlformats.org/drawingml/2006/main">
+              <a:graphicData uri="http://schemas.openxmlformats.org/drawingml/2006/picture">
+                <pic:pic xmlns:pic="http://schemas.openxmlformats.org/drawingml/2006/picture">
+                  <pic:nvPicPr>
+                    <pic:cNvPr id="2073707413" name=""/>
+                    <pic:cNvPicPr/>
+                  </pic:nvPicPr>
+                  <pic:blipFill>
+                    <a:blip r:embed="rId25"/>
+                    <a:stretch>
+                      <a:fillRect/>
+                    </a:stretch>
+                  </pic:blipFill>
+                  <pic:spPr>
+                    <a:xfrm>
+                      <a:off x="0" y="0"/>
+                      <a:ext cx="5943600" cy="2658110"/>
+                    </a:xfrm>
+                    <a:prstGeom prst="rect">
+                      <a:avLst/>
+                    </a:prstGeom>
+                  </pic:spPr>
+                </pic:pic>
+              </a:graphicData>
+            </a:graphic>
+          </wp:inline>
+        </w:drawing>
+      </w:r>
+    </w:p>
+    <w:p>
+      <w:pPr>
+        <w:rPr>
+          <w:rFonts w:ascii="Times New Roman" w:hAnsi="Times New Roman" w:cs="Times New Roman"/>
+          <w:sz w:val="24"/>
+          <w:szCs w:val="24"/>
+        </w:rPr>
+      </w:pPr>
+      <w:r>
+        <w:rPr>
+          <w:rFonts w:ascii="Times New Roman" w:hAnsi="Times New Roman" w:cs="Times New Roman"/>
+          <w:sz w:val="24"/>
+          <w:szCs w:val="24"/>
+        </w:rPr>
+        <w:drawing>
+          <wp:inline distT="0" distB="0" distL="0" distR="0" wp14:anchorId="3FB70AF9" wp14:editId="6E1FC592">
+            <wp:extent cx="5943600" cy="984250"/>
+            <wp:effectExtent l="0" t="0" r="0" b="6350"/>
+            <wp:docPr id="310754816" name="Picture 1"/>
+            <wp:cNvGraphicFramePr>
+              <a:graphicFrameLocks xmlns:a="http://schemas.openxmlformats.org/drawingml/2006/main" noChangeAspect="1"/>
+            </wp:cNvGraphicFramePr>
+            <a:graphic xmlns:a="http://schemas.openxmlformats.org/drawingml/2006/main">
+              <a:graphicData uri="http://schemas.openxmlformats.org/drawingml/2006/picture">
+                <pic:pic xmlns:pic="http://schemas.openxmlformats.org/drawingml/2006/picture">
+                  <pic:nvPicPr>
+                    <pic:cNvPr id="310754816" name=""/>
+                    <pic:cNvPicPr/>
+                  </pic:nvPicPr>
+                  <pic:blipFill>
+                    <a:blip r:embed="rId26"/>
+                    <a:stretch>
+                      <a:fillRect/>
+                    </a:stretch>
+                  </pic:blipFill>
+                  <pic:spPr>
+                    <a:xfrm>
+                      <a:off x="0" y="0"/>
+                      <a:ext cx="5943600" cy="984250"/>
+                    </a:xfrm>
+                    <a:prstGeom prst="rect">
+                      <a:avLst/>
+                    </a:prstGeom>
+                  </pic:spPr>
+                </pic:pic>
+              </a:graphicData>
+            </a:graphic>
+          </wp:inline>
+        </w:drawing>
+      </w:r>
+    </w:p>
+    <w:p>
+      <w:pPr>
+        <w:rPr>
+          <w:rFonts w:ascii="Times New Roman" w:hAnsi="Times New Roman" w:cs="Times New Roman"/>
+          <w:sz w:val="24"/>
+          <w:szCs w:val="24"/>
+        </w:rPr>
+      </w:pPr>
+      <w:r>
+        <w:rPr>
+          <w:rFonts w:ascii="Times New Roman" w:hAnsi="Times New Roman" w:cs="Times New Roman"/>
+          <w:sz w:val="24"/>
+          <w:szCs w:val="24"/>
+        </w:rPr>
+        <w:drawing>
+          <wp:inline distT="0" distB="0" distL="0" distR="0" wp14:anchorId="27C3577F" wp14:editId="4D24C36D">
+            <wp:extent cx="5943600" cy="970280"/>
+            <wp:effectExtent l="0" t="0" r="0" b="1270"/>
+            <wp:docPr id="677377284" name="Picture 1"/>
+            <wp:cNvGraphicFramePr>
+              <a:graphicFrameLocks xmlns:a="http://schemas.openxmlformats.org/drawingml/2006/main" noChangeAspect="1"/>
+            </wp:cNvGraphicFramePr>
+            <a:graphic xmlns:a="http://schemas.openxmlformats.org/drawingml/2006/main">
+              <a:graphicData uri="http://schemas.openxmlformats.org/drawingml/2006/picture">
+                <pic:pic xmlns:pic="http://schemas.openxmlformats.org/drawingml/2006/picture">
+                  <pic:nvPicPr>
+                    <pic:cNvPr id="677377284" name=""/>
+                    <pic:cNvPicPr/>
+                  </pic:nvPicPr>
+                  <pic:blipFill>
+                    <a:blip r:embed="rId27"/>
+                    <a:stretch>
+                      <a:fillRect/>
+                    </a:stretch>
+                  </pic:blipFill>
+                  <pic:spPr>
+                    <a:xfrm>
+                      <a:off x="0" y="0"/>
+                      <a:ext cx="5943600" cy="970280"/>
+                    </a:xfrm>
+                    <a:prstGeom prst="rect">
+                      <a:avLst/>
+                    </a:prstGeom>
+                  </pic:spPr>
+                </pic:pic>
+              </a:graphicData>
+            </a:graphic>
+          </wp:inline>
+        </w:drawing>
+      </w:r>
+    </w:p>
+    <w:p>
+      <w:pPr>
+        <w:rPr>
+          <w:rFonts w:ascii="Times New Roman" w:hAnsi="Times New Roman" w:cs="Times New Roman"/>
+          <w:sz w:val="24"/>
+          <w:szCs w:val="24"/>
+        </w:rPr>
+      </w:pPr>
+      <w:r>
+        <w:rPr>
+          <w:rFonts w:ascii="Times New Roman" w:hAnsi="Times New Roman" w:cs="Times New Roman"/>
+          <w:sz w:val="24"/>
+          <w:szCs w:val="24"/>
+        </w:rPr>
+        <w:drawing>
+          <wp:inline distT="0" distB="0" distL="0" distR="0" wp14:anchorId="39D420B0" wp14:editId="66A73227">
+            <wp:extent cx="5943600" cy="790575"/>
+            <wp:effectExtent l="0" t="0" r="0" b="9525"/>
+            <wp:docPr id="1161226534" name="Picture 1"/>
+            <wp:cNvGraphicFramePr>
+              <a:graphicFrameLocks xmlns:a="http://schemas.openxmlformats.org/drawingml/2006/main" noChangeAspect="1"/>
+            </wp:cNvGraphicFramePr>
+            <a:graphic xmlns:a="http://schemas.openxmlformats.org/drawingml/2006/main">
+              <a:graphicData uri="http://schemas.openxmlformats.org/drawingml/2006/picture">
+                <pic:pic xmlns:pic="http://schemas.openxmlformats.org/drawingml/2006/picture">
+                  <pic:nvPicPr>
+                    <pic:cNvPr id="1161226534" name=""/>
+                    <pic:cNvPicPr/>
+                  </pic:nvPicPr>
+                  <pic:blipFill>
+                    <a:blip r:embed="rId28"/>
+                    <a:stretch>
+                      <a:fillRect/>
+                    </a:stretch>
+                  </pic:blipFill>
+                  <pic:spPr>
+                    <a:xfrm>
+                      <a:off x="0" y="0"/>
+                      <a:ext cx="5943600" cy="790575"/>
+                    </a:xfrm>
+                    <a:prstGeom prst="rect">
+                      <a:avLst/>
+                    </a:prstGeom>
+                  </pic:spPr>
+                </pic:pic>
+              </a:graphicData>
+            </a:graphic>
+          </wp:inline>
+        </w:drawing>
+      </w:r>
+    </w:p>
+    <w:p>
+      <w:pPr>
+        <w:rPr>
+          <w:rFonts w:ascii="Times New Roman" w:hAnsi="Times New Roman" w:cs="Times New Roman"/>
+          <w:sz w:val="24"/>
+          <w:szCs w:val="24"/>
+        </w:rPr>
+      </w:pPr>
+      <w:r>
+        <w:rPr>
+          <w:rFonts w:ascii="Times New Roman" w:hAnsi="Times New Roman" w:cs="Times New Roman"/>
+          <w:sz w:val="24"/>
+          <w:szCs w:val="24"/>
+        </w:rPr>
+        <w:drawing>
+          <wp:inline distT="0" distB="0" distL="0" distR="0" wp14:anchorId="50DF1BBC" wp14:editId="685DE8A7">
+            <wp:extent cx="5943600" cy="778510"/>
+            <wp:effectExtent l="0" t="0" r="0" b="2540"/>
+            <wp:docPr id="1494480328" name="Picture 1"/>
+            <wp:cNvGraphicFramePr>
+              <a:graphicFrameLocks xmlns:a="http://schemas.openxmlformats.org/drawingml/2006/main" noChangeAspect="1"/>
+            </wp:cNvGraphicFramePr>
+            <a:graphic xmlns:a="http://schemas.openxmlformats.org/drawingml/2006/main">
+              <a:graphicData uri="http://schemas.openxmlformats.org/drawingml/2006/picture">
+                <pic:pic xmlns:pic="http://schemas.openxmlformats.org/drawingml/2006/picture">
+                  <pic:nvPicPr>
+                    <pic:cNvPr id="1494480328" name=""/>
+                    <pic:cNvPicPr/>
+                  </pic:nvPicPr>
+                  <pic:blipFill>
+                    <a:blip r:embed="rId29"/>
+                    <a:stretch>
+                      <a:fillRect/>
+                    </a:stretch>
+                  </pic:blipFill>
+                  <pic:spPr>
+                    <a:xfrm>
+                      <a:off x="0" y="0"/>
+                      <a:ext cx="5943600" cy="778510"/>
+                    </a:xfrm>
+                    <a:prstGeom prst="rect">
+                      <a:avLst/>
+                    </a:prstGeom>
+                  </pic:spPr>
+                </pic:pic>
+              </a:graphicData>
+            </a:graphic>
+          </wp:inline>
+        </w:drawing>
+      </w:r>
     </w:p>
     <w:p>
       <w:pPr>
@@ -2223,6 +2652,7 @@
           <w:sz w:val="18"/>
           <w:szCs w:val="24"/>
         </w:rPr>
+        <w:lastRenderedPageBreak/>
         <w:t>Social</w:t>
       </w:r>
     </w:p>
@@ -2587,6 +3017,7 @@
                 <w:szCs w:val="24"/>
               </w:rPr>
             </w:pPr>
+            <w:proofErr w:type="gramStart"/>
             <w:r>
               <w:rPr>
                 <w:rFonts w:ascii="Times New Roman" w:hAnsi="Times New Roman" w:cs="Times New Roman"/>
@@ -2596,6 +3027,7 @@
               </w:rPr>
               <w:t>Address Relevant Implication</w:t>
             </w:r>
+            <w:proofErr w:type="gramEnd"/>
             <w:r>
               <w:rPr>
                 <w:rFonts w:ascii="Times New Roman" w:hAnsi="Times New Roman" w:cs="Times New Roman"/>
@@ -3586,13 +4018,23 @@
                 <w:szCs w:val="20"/>
               </w:rPr>
             </w:pPr>
-            <w:r>
-              <w:rPr>
-                <w:rFonts w:ascii="Times New Roman" w:hAnsi="Times New Roman" w:cs="Times New Roman"/>
-                <w:sz w:val="20"/>
-                <w:szCs w:val="20"/>
-              </w:rPr>
-              <w:t>Enter Alphabets in Age Field</w:t>
+            <w:proofErr w:type="gramStart"/>
+            <w:r>
+              <w:rPr>
+                <w:rFonts w:ascii="Times New Roman" w:hAnsi="Times New Roman" w:cs="Times New Roman"/>
+                <w:sz w:val="20"/>
+                <w:szCs w:val="20"/>
+              </w:rPr>
+              <w:t>Enter</w:t>
+            </w:r>
+            <w:proofErr w:type="gramEnd"/>
+            <w:r>
+              <w:rPr>
+                <w:rFonts w:ascii="Times New Roman" w:hAnsi="Times New Roman" w:cs="Times New Roman"/>
+                <w:sz w:val="20"/>
+                <w:szCs w:val="20"/>
+              </w:rPr>
+              <w:t xml:space="preserve"> Alphabets in Age Field</w:t>
             </w:r>
           </w:p>
         </w:tc>
@@ -3777,7 +4219,16 @@
                 <w:sz w:val="20"/>
                 <w:szCs w:val="20"/>
               </w:rPr>
-              <w:t>Query to Display All Students Names Who Are Absent in Year 9</w:t>
+              <w:t xml:space="preserve">Query to Display All Students </w:t>
+            </w:r>
+            <w:r>
+              <w:rPr>
+                <w:rFonts w:ascii="Times New Roman" w:hAnsi="Times New Roman" w:cs="Times New Roman"/>
+                <w:sz w:val="20"/>
+                <w:szCs w:val="20"/>
+              </w:rPr>
+              <w:lastRenderedPageBreak/>
+              <w:t>Names Who Are Absent in Year 9</w:t>
             </w:r>
           </w:p>
         </w:tc>
@@ -3801,7 +4252,17 @@
                 <w:sz w:val="20"/>
                 <w:szCs w:val="20"/>
               </w:rPr>
-              <w:t>Names of Year 9 Students Who Are Absent</w:t>
+              <w:lastRenderedPageBreak/>
+              <w:t xml:space="preserve">Names of Year 9 </w:t>
+            </w:r>
+            <w:r>
+              <w:rPr>
+                <w:rFonts w:ascii="Times New Roman" w:hAnsi="Times New Roman" w:cs="Times New Roman"/>
+                <w:sz w:val="20"/>
+                <w:szCs w:val="20"/>
+              </w:rPr>
+              <w:lastRenderedPageBreak/>
+              <w:t>Students Who Are Absent</w:t>
             </w:r>
           </w:p>
         </w:tc>
@@ -3825,7 +4286,17 @@
                 <w:sz w:val="20"/>
                 <w:szCs w:val="20"/>
               </w:rPr>
-              <w:t>Names of Year 9 Students Who are Absent and Present</w:t>
+              <w:lastRenderedPageBreak/>
+              <w:t xml:space="preserve">Names of Year 9 Students Who </w:t>
+            </w:r>
+            <w:r>
+              <w:rPr>
+                <w:rFonts w:ascii="Times New Roman" w:hAnsi="Times New Roman" w:cs="Times New Roman"/>
+                <w:sz w:val="20"/>
+                <w:szCs w:val="20"/>
+              </w:rPr>
+              <w:lastRenderedPageBreak/>
+              <w:t>are Absent and Present</w:t>
             </w:r>
           </w:p>
         </w:tc>
@@ -3852,6 +4323,7 @@
                 <w:sz w:val="20"/>
                 <w:szCs w:val="20"/>
               </w:rPr>
+              <w:lastRenderedPageBreak/>
               <w:t>Fail</w:t>
             </w:r>
           </w:p>
@@ -3876,7 +4348,16 @@
                 <w:sz w:val="20"/>
                 <w:szCs w:val="20"/>
               </w:rPr>
-              <w:t xml:space="preserve">Modify Query to show only absent students. </w:t>
+              <w:t xml:space="preserve">Modify Query to show only absent </w:t>
+            </w:r>
+            <w:r>
+              <w:rPr>
+                <w:rFonts w:ascii="Times New Roman" w:hAnsi="Times New Roman" w:cs="Times New Roman"/>
+                <w:sz w:val="20"/>
+                <w:szCs w:val="20"/>
+              </w:rPr>
+              <w:lastRenderedPageBreak/>
+              <w:t xml:space="preserve">students. </w:t>
             </w:r>
             <w:r>
               <w:rPr>
@@ -3932,6 +4413,7 @@
                 <w:sz w:val="20"/>
                 <w:szCs w:val="20"/>
               </w:rPr>
+              <w:lastRenderedPageBreak/>
               <w:t>5</w:t>
             </w:r>
           </w:p>
@@ -4156,16 +4638,7 @@
                 <w:sz w:val="20"/>
                 <w:szCs w:val="20"/>
               </w:rPr>
-              <w:t xml:space="preserve">Enter Data in Loan Table about a Device Lend to a Student </w:t>
-            </w:r>
-            <w:r>
-              <w:rPr>
-                <w:rFonts w:ascii="Times New Roman" w:hAnsi="Times New Roman" w:cs="Times New Roman"/>
-                <w:sz w:val="20"/>
-                <w:szCs w:val="20"/>
-              </w:rPr>
-              <w:lastRenderedPageBreak/>
-              <w:t>Who Does Not Exist in Student Table</w:t>
+              <w:t>Enter Data in Loan Table about a Device Lend to a Student Who Does Not Exist in Student Table</w:t>
             </w:r>
           </w:p>
         </w:tc>
@@ -4189,7 +4662,6 @@
                 <w:sz w:val="20"/>
                 <w:szCs w:val="20"/>
               </w:rPr>
-              <w:lastRenderedPageBreak/>
               <w:t>Error for non-existing record in student table</w:t>
             </w:r>
           </w:p>
@@ -4264,16 +4736,7 @@
                 <w:sz w:val="20"/>
                 <w:szCs w:val="20"/>
               </w:rPr>
-              <w:t xml:space="preserve">Relationship between Load and Student Table is </w:t>
-            </w:r>
-            <w:r>
-              <w:rPr>
-                <w:rFonts w:ascii="Times New Roman" w:hAnsi="Times New Roman" w:cs="Times New Roman"/>
-                <w:sz w:val="20"/>
-                <w:szCs w:val="20"/>
-              </w:rPr>
-              <w:lastRenderedPageBreak/>
-              <w:t>Working Correctly</w:t>
+              <w:t>Relationship between Load and Student Table is Working Correctly</w:t>
             </w:r>
           </w:p>
         </w:tc>
@@ -4302,7 +4765,6 @@
                 <w:sz w:val="20"/>
                 <w:szCs w:val="20"/>
               </w:rPr>
-              <w:lastRenderedPageBreak/>
               <w:t>7</w:t>
             </w:r>
           </w:p>
@@ -5253,7 +5715,25 @@
           <w:sz w:val="18"/>
           <w:szCs w:val="24"/>
         </w:rPr>
-        <w:t>Make sure to record iterative improvement in the below table as well as video evidence.)</w:t>
+        <w:t xml:space="preserve">Make sure to record iterative improvement in the </w:t>
+      </w:r>
+      <w:proofErr w:type="gramStart"/>
+      <w:r>
+        <w:rPr>
+          <w:rFonts w:ascii="Times New Roman" w:hAnsi="Times New Roman" w:cs="Times New Roman"/>
+          <w:sz w:val="18"/>
+          <w:szCs w:val="24"/>
+        </w:rPr>
+        <w:t>below table</w:t>
+      </w:r>
+      <w:proofErr w:type="gramEnd"/>
+      <w:r>
+        <w:rPr>
+          <w:rFonts w:ascii="Times New Roman" w:hAnsi="Times New Roman" w:cs="Times New Roman"/>
+          <w:sz w:val="18"/>
+          <w:szCs w:val="24"/>
+        </w:rPr>
+        <w:t xml:space="preserve"> as well as video evidence.)</w:t>
       </w:r>
     </w:p>
     <w:p>
@@ -5290,7 +5770,27 @@
           <w:sz w:val="18"/>
           <w:szCs w:val="24"/>
         </w:rPr>
-        <w:t xml:space="preserve"> is required throughout the design, development and testing process.</w:t>
+        <w:t xml:space="preserve"> </w:t>
+      </w:r>
+      <w:proofErr w:type="gramStart"/>
+      <w:r>
+        <w:rPr>
+          <w:rFonts w:ascii="Times New Roman" w:hAnsi="Times New Roman" w:cs="Times New Roman"/>
+          <w:color w:val="FF0000"/>
+          <w:sz w:val="18"/>
+          <w:szCs w:val="24"/>
+        </w:rPr>
+        <w:t>is</w:t>
+      </w:r>
+      <w:proofErr w:type="gramEnd"/>
+      <w:r>
+        <w:rPr>
+          <w:rFonts w:ascii="Times New Roman" w:hAnsi="Times New Roman" w:cs="Times New Roman"/>
+          <w:color w:val="FF0000"/>
+          <w:sz w:val="18"/>
+          <w:szCs w:val="24"/>
+        </w:rPr>
+        <w:t xml:space="preserve"> required throughout the design, development and testing process.</w:t>
       </w:r>
     </w:p>
     <w:tbl>
@@ -5933,6 +6433,7 @@
           <w:sz w:val="24"/>
           <w:szCs w:val="24"/>
         </w:rPr>
+        <w:lastRenderedPageBreak/>
         <w:t xml:space="preserve">11. </w:t>
       </w:r>
       <w:r>
@@ -6007,7 +6508,25 @@
           <w:sz w:val="18"/>
           <w:szCs w:val="24"/>
         </w:rPr>
-        <w:t xml:space="preserve"> show how queries, forms, sorting, and field organisation help users easily enter data and retrieve the information they need.)</w:t>
+        <w:t xml:space="preserve"> show how queries, forms, sorting, and field </w:t>
+      </w:r>
+      <w:proofErr w:type="spellStart"/>
+      <w:r>
+        <w:rPr>
+          <w:rFonts w:ascii="Times New Roman" w:hAnsi="Times New Roman" w:cs="Times New Roman"/>
+          <w:sz w:val="18"/>
+          <w:szCs w:val="24"/>
+        </w:rPr>
+        <w:t>organisation</w:t>
+      </w:r>
+      <w:proofErr w:type="spellEnd"/>
+      <w:r>
+        <w:rPr>
+          <w:rFonts w:ascii="Times New Roman" w:hAnsi="Times New Roman" w:cs="Times New Roman"/>
+          <w:sz w:val="18"/>
+          <w:szCs w:val="24"/>
+        </w:rPr>
+        <w:t xml:space="preserve"> help users easily enter data and retrieve the information they need.)</w:t>
       </w:r>
     </w:p>
     <w:sectPr>

</xml_diff>

<commit_message>
Removed "Switchboard" as I made custom ones
</commit_message>
<xml_diff>
--- a/L2DTS - 91892 Database Visual Diary.docx
+++ b/L2DTS - 91892 Database Visual Diary.docx
@@ -344,25 +344,7 @@
                 <w:sz w:val="20"/>
                 <w:szCs w:val="20"/>
               </w:rPr>
-              <w:t xml:space="preserve">Linking data </w:t>
-            </w:r>
-            <w:proofErr w:type="gramStart"/>
-            <w:r>
-              <w:rPr>
-                <w:rFonts w:ascii="Times New Roman" w:hAnsi="Times New Roman" w:cs="Times New Roman"/>
-                <w:sz w:val="20"/>
-                <w:szCs w:val="20"/>
-              </w:rPr>
-              <w:t>in</w:t>
-            </w:r>
-            <w:proofErr w:type="gramEnd"/>
-            <w:r>
-              <w:rPr>
-                <w:rFonts w:ascii="Times New Roman" w:hAnsi="Times New Roman" w:cs="Times New Roman"/>
-                <w:sz w:val="20"/>
-                <w:szCs w:val="20"/>
-              </w:rPr>
-              <w:t xml:space="preserve"> related tables or nodes using queries or keys</w:t>
+              <w:t>Linking data in related tables or nodes using queries or keys</w:t>
             </w:r>
           </w:p>
         </w:tc>
@@ -515,23 +497,13 @@
                 <w:szCs w:val="20"/>
               </w:rPr>
             </w:pPr>
-            <w:proofErr w:type="spellStart"/>
-            <w:r>
-              <w:rPr>
-                <w:rFonts w:ascii="Times New Roman" w:hAnsi="Times New Roman" w:cs="Times New Roman"/>
-                <w:sz w:val="20"/>
-                <w:szCs w:val="20"/>
-              </w:rPr>
-              <w:t>Customising</w:t>
-            </w:r>
-            <w:proofErr w:type="spellEnd"/>
-            <w:r>
-              <w:rPr>
-                <w:rFonts w:ascii="Times New Roman" w:hAnsi="Times New Roman" w:cs="Times New Roman"/>
-                <w:sz w:val="20"/>
-                <w:szCs w:val="20"/>
-              </w:rPr>
-              <w:t xml:space="preserve"> presentation of the data</w:t>
+            <w:r>
+              <w:rPr>
+                <w:rFonts w:ascii="Times New Roman" w:hAnsi="Times New Roman" w:cs="Times New Roman"/>
+                <w:sz w:val="20"/>
+                <w:szCs w:val="20"/>
+              </w:rPr>
+              <w:t>Customising presentation of the data</w:t>
             </w:r>
           </w:p>
         </w:tc>
@@ -1421,6 +1393,7 @@
       <w:r>
         <w:rPr>
           <w:rFonts w:ascii="Times New Roman" w:hAnsi="Times New Roman" w:cs="Times New Roman"/>
+          <w:noProof/>
           <w:sz w:val="28"/>
           <w:szCs w:val="28"/>
         </w:rPr>
@@ -1472,6 +1445,7 @@
       <w:r>
         <w:rPr>
           <w:rFonts w:ascii="Times New Roman" w:hAnsi="Times New Roman" w:cs="Times New Roman"/>
+          <w:noProof/>
           <w:sz w:val="28"/>
           <w:szCs w:val="28"/>
         </w:rPr>
@@ -1524,6 +1498,7 @@
       <w:r>
         <w:rPr>
           <w:rFonts w:ascii="Times New Roman" w:hAnsi="Times New Roman" w:cs="Times New Roman"/>
+          <w:noProof/>
           <w:sz w:val="28"/>
           <w:szCs w:val="28"/>
         </w:rPr>
@@ -1575,6 +1550,7 @@
       <w:r>
         <w:rPr>
           <w:rFonts w:ascii="Times New Roman" w:hAnsi="Times New Roman" w:cs="Times New Roman"/>
+          <w:noProof/>
           <w:sz w:val="28"/>
           <w:szCs w:val="28"/>
         </w:rPr>
@@ -1626,6 +1602,7 @@
       <w:r>
         <w:rPr>
           <w:rFonts w:ascii="Times New Roman" w:hAnsi="Times New Roman" w:cs="Times New Roman"/>
+          <w:noProof/>
           <w:sz w:val="28"/>
           <w:szCs w:val="28"/>
         </w:rPr>
@@ -1678,6 +1655,7 @@
       <w:r>
         <w:rPr>
           <w:rFonts w:ascii="Times New Roman" w:hAnsi="Times New Roman" w:cs="Times New Roman"/>
+          <w:noProof/>
           <w:sz w:val="28"/>
           <w:szCs w:val="28"/>
         </w:rPr>
@@ -1729,6 +1707,7 @@
       <w:r>
         <w:rPr>
           <w:rFonts w:ascii="Times New Roman" w:hAnsi="Times New Roman" w:cs="Times New Roman"/>
+          <w:noProof/>
           <w:sz w:val="28"/>
           <w:szCs w:val="28"/>
         </w:rPr>
@@ -1780,6 +1759,7 @@
       <w:r>
         <w:rPr>
           <w:rFonts w:ascii="Times New Roman" w:hAnsi="Times New Roman" w:cs="Times New Roman"/>
+          <w:noProof/>
           <w:sz w:val="28"/>
           <w:szCs w:val="28"/>
         </w:rPr>
@@ -1832,6 +1812,7 @@
       <w:r>
         <w:rPr>
           <w:rFonts w:ascii="Times New Roman" w:hAnsi="Times New Roman" w:cs="Times New Roman"/>
+          <w:noProof/>
           <w:sz w:val="28"/>
           <w:szCs w:val="28"/>
         </w:rPr>
@@ -1883,6 +1864,7 @@
       <w:r>
         <w:rPr>
           <w:rFonts w:ascii="Times New Roman" w:hAnsi="Times New Roman" w:cs="Times New Roman"/>
+          <w:noProof/>
           <w:sz w:val="28"/>
           <w:szCs w:val="28"/>
         </w:rPr>
@@ -2459,38 +2441,21 @@
           <w:sz w:val="24"/>
           <w:szCs w:val="24"/>
         </w:rPr>
-        <w:t xml:space="preserve">shows all relevant information for orders that have </w:t>
-      </w:r>
-      <w:proofErr w:type="gramStart"/>
-      <w:r>
-        <w:rPr>
-          <w:rFonts w:ascii="Times New Roman" w:hAnsi="Times New Roman" w:cs="Times New Roman"/>
-          <w:sz w:val="24"/>
-          <w:szCs w:val="24"/>
-        </w:rPr>
-        <w:t>biltong</w:t>
-      </w:r>
-      <w:proofErr w:type="gramEnd"/>
-      <w:r>
-        <w:rPr>
-          <w:rFonts w:ascii="Times New Roman" w:hAnsi="Times New Roman" w:cs="Times New Roman"/>
-          <w:sz w:val="24"/>
-          <w:szCs w:val="24"/>
-        </w:rPr>
-        <w:t xml:space="preserve"> in the order</w:t>
-      </w:r>
-    </w:p>
-    <w:p>
-      <w:pPr>
-        <w:rPr>
-          <w:rFonts w:ascii="Times New Roman" w:hAnsi="Times New Roman" w:cs="Times New Roman"/>
-          <w:sz w:val="24"/>
-          <w:szCs w:val="24"/>
-        </w:rPr>
-      </w:pPr>
-      <w:r>
-        <w:rPr>
-          <w:rFonts w:ascii="Times New Roman" w:hAnsi="Times New Roman" w:cs="Times New Roman"/>
+        <w:t>shows all relevant information for orders that have biltong in the order</w:t>
+      </w:r>
+    </w:p>
+    <w:p>
+      <w:pPr>
+        <w:rPr>
+          <w:rFonts w:ascii="Times New Roman" w:hAnsi="Times New Roman" w:cs="Times New Roman"/>
+          <w:sz w:val="24"/>
+          <w:szCs w:val="24"/>
+        </w:rPr>
+      </w:pPr>
+      <w:r>
+        <w:rPr>
+          <w:rFonts w:ascii="Times New Roman" w:hAnsi="Times New Roman" w:cs="Times New Roman"/>
+          <w:noProof/>
           <w:sz w:val="24"/>
           <w:szCs w:val="24"/>
         </w:rPr>
@@ -2564,82 +2529,29 @@
           <w:szCs w:val="24"/>
         </w:rPr>
         <w:lastRenderedPageBreak/>
-        <w:t xml:space="preserve">This query shows </w:t>
-      </w:r>
-      <w:proofErr w:type="gramStart"/>
-      <w:r>
-        <w:rPr>
-          <w:rFonts w:ascii="Times New Roman" w:hAnsi="Times New Roman" w:cs="Times New Roman"/>
-          <w:sz w:val="24"/>
-          <w:szCs w:val="24"/>
-        </w:rPr>
-        <w:t>all of</w:t>
-      </w:r>
-      <w:proofErr w:type="gramEnd"/>
-      <w:r>
-        <w:rPr>
-          <w:rFonts w:ascii="Times New Roman" w:hAnsi="Times New Roman" w:cs="Times New Roman"/>
-          <w:sz w:val="24"/>
-          <w:szCs w:val="24"/>
-        </w:rPr>
-        <w:t xml:space="preserve"> the </w:t>
-      </w:r>
-      <w:proofErr w:type="gramStart"/>
-      <w:r>
-        <w:rPr>
-          <w:rFonts w:ascii="Times New Roman" w:hAnsi="Times New Roman" w:cs="Times New Roman"/>
-          <w:sz w:val="24"/>
-          <w:szCs w:val="24"/>
-        </w:rPr>
-        <w:t>completed</w:t>
-      </w:r>
-      <w:proofErr w:type="gramEnd"/>
-      <w:r>
-        <w:rPr>
-          <w:rFonts w:ascii="Times New Roman" w:hAnsi="Times New Roman" w:cs="Times New Roman"/>
-          <w:sz w:val="24"/>
-          <w:szCs w:val="24"/>
-        </w:rPr>
-        <w:t xml:space="preserve"> </w:t>
-      </w:r>
-      <w:r>
-        <w:rPr>
-          <w:rFonts w:ascii="Times New Roman" w:hAnsi="Times New Roman" w:cs="Times New Roman"/>
-          <w:sz w:val="24"/>
-          <w:szCs w:val="24"/>
-        </w:rPr>
-        <w:t xml:space="preserve">orders with </w:t>
-      </w:r>
-      <w:proofErr w:type="gramStart"/>
-      <w:r>
-        <w:rPr>
-          <w:rFonts w:ascii="Times New Roman" w:hAnsi="Times New Roman" w:cs="Times New Roman"/>
-          <w:sz w:val="24"/>
-          <w:szCs w:val="24"/>
-        </w:rPr>
-        <w:t>all of</w:t>
-      </w:r>
-      <w:proofErr w:type="gramEnd"/>
-      <w:r>
-        <w:rPr>
-          <w:rFonts w:ascii="Times New Roman" w:hAnsi="Times New Roman" w:cs="Times New Roman"/>
-          <w:sz w:val="24"/>
-          <w:szCs w:val="24"/>
-        </w:rPr>
-        <w:t xml:space="preserve"> the relevant information</w:t>
-      </w:r>
-    </w:p>
-    <w:p>
-      <w:pPr>
-        <w:rPr>
-          <w:rFonts w:ascii="Times New Roman" w:hAnsi="Times New Roman" w:cs="Times New Roman"/>
-          <w:sz w:val="24"/>
-          <w:szCs w:val="24"/>
-        </w:rPr>
-      </w:pPr>
-      <w:r>
-        <w:rPr>
-          <w:rFonts w:ascii="Times New Roman" w:hAnsi="Times New Roman" w:cs="Times New Roman"/>
+        <w:t xml:space="preserve">This query shows all of the completed </w:t>
+      </w:r>
+      <w:r>
+        <w:rPr>
+          <w:rFonts w:ascii="Times New Roman" w:hAnsi="Times New Roman" w:cs="Times New Roman"/>
+          <w:sz w:val="24"/>
+          <w:szCs w:val="24"/>
+        </w:rPr>
+        <w:t>orders with all of the relevant information</w:t>
+      </w:r>
+    </w:p>
+    <w:p>
+      <w:pPr>
+        <w:rPr>
+          <w:rFonts w:ascii="Times New Roman" w:hAnsi="Times New Roman" w:cs="Times New Roman"/>
+          <w:sz w:val="24"/>
+          <w:szCs w:val="24"/>
+        </w:rPr>
+      </w:pPr>
+      <w:r>
+        <w:rPr>
+          <w:rFonts w:ascii="Times New Roman" w:hAnsi="Times New Roman" w:cs="Times New Roman"/>
+          <w:noProof/>
           <w:sz w:val="24"/>
           <w:szCs w:val="24"/>
         </w:rPr>
@@ -2694,25 +2606,7 @@
           <w:sz w:val="24"/>
           <w:szCs w:val="24"/>
         </w:rPr>
-        <w:t xml:space="preserve">This query shows </w:t>
-      </w:r>
-      <w:proofErr w:type="gramStart"/>
-      <w:r>
-        <w:rPr>
-          <w:rFonts w:ascii="Times New Roman" w:hAnsi="Times New Roman" w:cs="Times New Roman"/>
-          <w:sz w:val="24"/>
-          <w:szCs w:val="24"/>
-        </w:rPr>
-        <w:t>all of</w:t>
-      </w:r>
-      <w:proofErr w:type="gramEnd"/>
-      <w:r>
-        <w:rPr>
-          <w:rFonts w:ascii="Times New Roman" w:hAnsi="Times New Roman" w:cs="Times New Roman"/>
-          <w:sz w:val="24"/>
-          <w:szCs w:val="24"/>
-        </w:rPr>
-        <w:t xml:space="preserve"> the </w:t>
+        <w:t xml:space="preserve">This query shows all of the </w:t>
       </w:r>
       <w:r>
         <w:rPr>
@@ -2744,38 +2638,21 @@
           <w:sz w:val="24"/>
           <w:szCs w:val="24"/>
         </w:rPr>
-        <w:t xml:space="preserve"> orders with </w:t>
-      </w:r>
-      <w:proofErr w:type="gramStart"/>
-      <w:r>
-        <w:rPr>
-          <w:rFonts w:ascii="Times New Roman" w:hAnsi="Times New Roman" w:cs="Times New Roman"/>
-          <w:sz w:val="24"/>
-          <w:szCs w:val="24"/>
-        </w:rPr>
-        <w:t>all of</w:t>
-      </w:r>
-      <w:proofErr w:type="gramEnd"/>
-      <w:r>
-        <w:rPr>
-          <w:rFonts w:ascii="Times New Roman" w:hAnsi="Times New Roman" w:cs="Times New Roman"/>
-          <w:sz w:val="24"/>
-          <w:szCs w:val="24"/>
-        </w:rPr>
-        <w:t xml:space="preserve"> the relevant information</w:t>
-      </w:r>
-    </w:p>
-    <w:p>
-      <w:pPr>
-        <w:rPr>
-          <w:rFonts w:ascii="Times New Roman" w:hAnsi="Times New Roman" w:cs="Times New Roman"/>
-          <w:sz w:val="24"/>
-          <w:szCs w:val="24"/>
-        </w:rPr>
-      </w:pPr>
-      <w:r>
-        <w:rPr>
-          <w:rFonts w:ascii="Times New Roman" w:hAnsi="Times New Roman" w:cs="Times New Roman"/>
+        <w:t xml:space="preserve"> orders with all of the relevant information</w:t>
+      </w:r>
+    </w:p>
+    <w:p>
+      <w:pPr>
+        <w:rPr>
+          <w:rFonts w:ascii="Times New Roman" w:hAnsi="Times New Roman" w:cs="Times New Roman"/>
+          <w:sz w:val="24"/>
+          <w:szCs w:val="24"/>
+        </w:rPr>
+      </w:pPr>
+      <w:r>
+        <w:rPr>
+          <w:rFonts w:ascii="Times New Roman" w:hAnsi="Times New Roman" w:cs="Times New Roman"/>
+          <w:noProof/>
           <w:sz w:val="24"/>
           <w:szCs w:val="24"/>
         </w:rPr>
@@ -2901,25 +2778,7 @@
           <w:sz w:val="24"/>
           <w:szCs w:val="24"/>
         </w:rPr>
-        <w:t xml:space="preserve">shows </w:t>
-      </w:r>
-      <w:proofErr w:type="gramStart"/>
-      <w:r>
-        <w:rPr>
-          <w:rFonts w:ascii="Times New Roman" w:hAnsi="Times New Roman" w:cs="Times New Roman"/>
-          <w:sz w:val="24"/>
-          <w:szCs w:val="24"/>
-        </w:rPr>
-        <w:t>all of</w:t>
-      </w:r>
-      <w:proofErr w:type="gramEnd"/>
-      <w:r>
-        <w:rPr>
-          <w:rFonts w:ascii="Times New Roman" w:hAnsi="Times New Roman" w:cs="Times New Roman"/>
-          <w:sz w:val="24"/>
-          <w:szCs w:val="24"/>
-        </w:rPr>
-        <w:t xml:space="preserve"> the orders (incomplete/completed) </w:t>
+        <w:t xml:space="preserve">shows all of the orders (incomplete/completed) </w:t>
       </w:r>
       <w:r>
         <w:rPr>
@@ -2941,6 +2800,7 @@
       <w:r>
         <w:rPr>
           <w:rFonts w:ascii="Times New Roman" w:hAnsi="Times New Roman" w:cs="Times New Roman"/>
+          <w:noProof/>
           <w:sz w:val="24"/>
           <w:szCs w:val="24"/>
         </w:rPr>
@@ -3009,6 +2869,7 @@
       <w:r>
         <w:rPr>
           <w:rFonts w:ascii="Times New Roman" w:hAnsi="Times New Roman" w:cs="Times New Roman"/>
+          <w:noProof/>
           <w:sz w:val="24"/>
           <w:szCs w:val="24"/>
         </w:rPr>
@@ -3077,6 +2938,7 @@
       <w:r>
         <w:rPr>
           <w:rFonts w:ascii="Times New Roman" w:hAnsi="Times New Roman" w:cs="Times New Roman"/>
+          <w:noProof/>
           <w:sz w:val="24"/>
           <w:szCs w:val="24"/>
         </w:rPr>
@@ -3177,6 +3039,7 @@
       <w:r>
         <w:rPr>
           <w:rFonts w:ascii="Times New Roman" w:hAnsi="Times New Roman" w:cs="Times New Roman"/>
+          <w:noProof/>
           <w:sz w:val="24"/>
           <w:szCs w:val="24"/>
         </w:rPr>
@@ -3245,6 +3108,7 @@
       <w:r>
         <w:rPr>
           <w:rFonts w:ascii="Times New Roman" w:hAnsi="Times New Roman" w:cs="Times New Roman"/>
+          <w:noProof/>
           <w:sz w:val="24"/>
           <w:szCs w:val="24"/>
         </w:rPr>
@@ -3327,6 +3191,408 @@
           <w:szCs w:val="24"/>
         </w:rPr>
       </w:pPr>
+      <w:r>
+        <w:rPr>
+          <w:rFonts w:ascii="Times New Roman" w:hAnsi="Times New Roman" w:cs="Times New Roman"/>
+          <w:sz w:val="24"/>
+          <w:szCs w:val="24"/>
+        </w:rPr>
+        <w:drawing>
+          <wp:inline distT="0" distB="0" distL="0" distR="0" wp14:anchorId="6921DBDA" wp14:editId="3DF5215E">
+            <wp:extent cx="5943600" cy="2151380"/>
+            <wp:effectExtent l="0" t="0" r="0" b="1270"/>
+            <wp:docPr id="1275871031" name="Picture 1"/>
+            <wp:cNvGraphicFramePr>
+              <a:graphicFrameLocks xmlns:a="http://schemas.openxmlformats.org/drawingml/2006/main" noChangeAspect="1"/>
+            </wp:cNvGraphicFramePr>
+            <a:graphic xmlns:a="http://schemas.openxmlformats.org/drawingml/2006/main">
+              <a:graphicData uri="http://schemas.openxmlformats.org/drawingml/2006/picture">
+                <pic:pic xmlns:pic="http://schemas.openxmlformats.org/drawingml/2006/picture">
+                  <pic:nvPicPr>
+                    <pic:cNvPr id="1275871031" name=""/>
+                    <pic:cNvPicPr/>
+                  </pic:nvPicPr>
+                  <pic:blipFill>
+                    <a:blip r:embed="rId35"/>
+                    <a:stretch>
+                      <a:fillRect/>
+                    </a:stretch>
+                  </pic:blipFill>
+                  <pic:spPr>
+                    <a:xfrm>
+                      <a:off x="0" y="0"/>
+                      <a:ext cx="5943600" cy="2151380"/>
+                    </a:xfrm>
+                    <a:prstGeom prst="rect">
+                      <a:avLst/>
+                    </a:prstGeom>
+                  </pic:spPr>
+                </pic:pic>
+              </a:graphicData>
+            </a:graphic>
+          </wp:inline>
+        </w:drawing>
+      </w:r>
+    </w:p>
+    <w:p>
+      <w:pPr>
+        <w:rPr>
+          <w:rFonts w:ascii="Times New Roman" w:hAnsi="Times New Roman" w:cs="Times New Roman"/>
+          <w:sz w:val="24"/>
+          <w:szCs w:val="24"/>
+        </w:rPr>
+      </w:pPr>
+      <w:r>
+        <w:rPr>
+          <w:rFonts w:ascii="Times New Roman" w:hAnsi="Times New Roman" w:cs="Times New Roman"/>
+          <w:sz w:val="24"/>
+          <w:szCs w:val="24"/>
+        </w:rPr>
+        <w:drawing>
+          <wp:inline distT="0" distB="0" distL="0" distR="0" wp14:anchorId="10A9CBAA" wp14:editId="473ABD1D">
+            <wp:extent cx="5943600" cy="2122805"/>
+            <wp:effectExtent l="0" t="0" r="0" b="0"/>
+            <wp:docPr id="1013341787" name="Picture 1"/>
+            <wp:cNvGraphicFramePr>
+              <a:graphicFrameLocks xmlns:a="http://schemas.openxmlformats.org/drawingml/2006/main" noChangeAspect="1"/>
+            </wp:cNvGraphicFramePr>
+            <a:graphic xmlns:a="http://schemas.openxmlformats.org/drawingml/2006/main">
+              <a:graphicData uri="http://schemas.openxmlformats.org/drawingml/2006/picture">
+                <pic:pic xmlns:pic="http://schemas.openxmlformats.org/drawingml/2006/picture">
+                  <pic:nvPicPr>
+                    <pic:cNvPr id="1013341787" name=""/>
+                    <pic:cNvPicPr/>
+                  </pic:nvPicPr>
+                  <pic:blipFill>
+                    <a:blip r:embed="rId36"/>
+                    <a:stretch>
+                      <a:fillRect/>
+                    </a:stretch>
+                  </pic:blipFill>
+                  <pic:spPr>
+                    <a:xfrm>
+                      <a:off x="0" y="0"/>
+                      <a:ext cx="5943600" cy="2122805"/>
+                    </a:xfrm>
+                    <a:prstGeom prst="rect">
+                      <a:avLst/>
+                    </a:prstGeom>
+                  </pic:spPr>
+                </pic:pic>
+              </a:graphicData>
+            </a:graphic>
+          </wp:inline>
+        </w:drawing>
+      </w:r>
+    </w:p>
+    <w:p>
+      <w:pPr>
+        <w:rPr>
+          <w:rFonts w:ascii="Times New Roman" w:hAnsi="Times New Roman" w:cs="Times New Roman"/>
+          <w:sz w:val="24"/>
+          <w:szCs w:val="24"/>
+        </w:rPr>
+      </w:pPr>
+      <w:r>
+        <w:rPr>
+          <w:rFonts w:ascii="Times New Roman" w:hAnsi="Times New Roman" w:cs="Times New Roman"/>
+          <w:sz w:val="24"/>
+          <w:szCs w:val="24"/>
+        </w:rPr>
+        <w:drawing>
+          <wp:inline distT="0" distB="0" distL="0" distR="0" wp14:anchorId="400ED8B2" wp14:editId="7DE79710">
+            <wp:extent cx="5943600" cy="2108200"/>
+            <wp:effectExtent l="0" t="0" r="0" b="6350"/>
+            <wp:docPr id="835130206" name="Picture 1"/>
+            <wp:cNvGraphicFramePr>
+              <a:graphicFrameLocks xmlns:a="http://schemas.openxmlformats.org/drawingml/2006/main" noChangeAspect="1"/>
+            </wp:cNvGraphicFramePr>
+            <a:graphic xmlns:a="http://schemas.openxmlformats.org/drawingml/2006/main">
+              <a:graphicData uri="http://schemas.openxmlformats.org/drawingml/2006/picture">
+                <pic:pic xmlns:pic="http://schemas.openxmlformats.org/drawingml/2006/picture">
+                  <pic:nvPicPr>
+                    <pic:cNvPr id="835130206" name=""/>
+                    <pic:cNvPicPr/>
+                  </pic:nvPicPr>
+                  <pic:blipFill>
+                    <a:blip r:embed="rId37"/>
+                    <a:stretch>
+                      <a:fillRect/>
+                    </a:stretch>
+                  </pic:blipFill>
+                  <pic:spPr>
+                    <a:xfrm>
+                      <a:off x="0" y="0"/>
+                      <a:ext cx="5943600" cy="2108200"/>
+                    </a:xfrm>
+                    <a:prstGeom prst="rect">
+                      <a:avLst/>
+                    </a:prstGeom>
+                  </pic:spPr>
+                </pic:pic>
+              </a:graphicData>
+            </a:graphic>
+          </wp:inline>
+        </w:drawing>
+      </w:r>
+    </w:p>
+    <w:p>
+      <w:pPr>
+        <w:rPr>
+          <w:rFonts w:ascii="Times New Roman" w:hAnsi="Times New Roman" w:cs="Times New Roman"/>
+          <w:sz w:val="24"/>
+          <w:szCs w:val="24"/>
+        </w:rPr>
+      </w:pPr>
+      <w:r>
+        <w:rPr>
+          <w:rFonts w:ascii="Times New Roman" w:hAnsi="Times New Roman" w:cs="Times New Roman"/>
+          <w:sz w:val="24"/>
+          <w:szCs w:val="24"/>
+        </w:rPr>
+        <w:lastRenderedPageBreak/>
+        <w:drawing>
+          <wp:inline distT="0" distB="0" distL="0" distR="0" wp14:anchorId="5F9BADF3" wp14:editId="7709162F">
+            <wp:extent cx="5943600" cy="2057400"/>
+            <wp:effectExtent l="0" t="0" r="0" b="0"/>
+            <wp:docPr id="544004987" name="Picture 1"/>
+            <wp:cNvGraphicFramePr>
+              <a:graphicFrameLocks xmlns:a="http://schemas.openxmlformats.org/drawingml/2006/main" noChangeAspect="1"/>
+            </wp:cNvGraphicFramePr>
+            <a:graphic xmlns:a="http://schemas.openxmlformats.org/drawingml/2006/main">
+              <a:graphicData uri="http://schemas.openxmlformats.org/drawingml/2006/picture">
+                <pic:pic xmlns:pic="http://schemas.openxmlformats.org/drawingml/2006/picture">
+                  <pic:nvPicPr>
+                    <pic:cNvPr id="544004987" name=""/>
+                    <pic:cNvPicPr/>
+                  </pic:nvPicPr>
+                  <pic:blipFill>
+                    <a:blip r:embed="rId38"/>
+                    <a:stretch>
+                      <a:fillRect/>
+                    </a:stretch>
+                  </pic:blipFill>
+                  <pic:spPr>
+                    <a:xfrm>
+                      <a:off x="0" y="0"/>
+                      <a:ext cx="5943600" cy="2057400"/>
+                    </a:xfrm>
+                    <a:prstGeom prst="rect">
+                      <a:avLst/>
+                    </a:prstGeom>
+                  </pic:spPr>
+                </pic:pic>
+              </a:graphicData>
+            </a:graphic>
+          </wp:inline>
+        </w:drawing>
+      </w:r>
+    </w:p>
+    <w:p>
+      <w:pPr>
+        <w:rPr>
+          <w:rFonts w:ascii="Times New Roman" w:hAnsi="Times New Roman" w:cs="Times New Roman"/>
+          <w:sz w:val="24"/>
+          <w:szCs w:val="24"/>
+        </w:rPr>
+      </w:pPr>
+      <w:r>
+        <w:rPr>
+          <w:rFonts w:ascii="Times New Roman" w:hAnsi="Times New Roman" w:cs="Times New Roman"/>
+          <w:sz w:val="24"/>
+          <w:szCs w:val="24"/>
+        </w:rPr>
+        <w:drawing>
+          <wp:inline distT="0" distB="0" distL="0" distR="0" wp14:anchorId="4364E9D6" wp14:editId="116B97A1">
+            <wp:extent cx="4020111" cy="2638793"/>
+            <wp:effectExtent l="0" t="0" r="0" b="9525"/>
+            <wp:docPr id="246813095" name="Picture 1"/>
+            <wp:cNvGraphicFramePr>
+              <a:graphicFrameLocks xmlns:a="http://schemas.openxmlformats.org/drawingml/2006/main" noChangeAspect="1"/>
+            </wp:cNvGraphicFramePr>
+            <a:graphic xmlns:a="http://schemas.openxmlformats.org/drawingml/2006/main">
+              <a:graphicData uri="http://schemas.openxmlformats.org/drawingml/2006/picture">
+                <pic:pic xmlns:pic="http://schemas.openxmlformats.org/drawingml/2006/picture">
+                  <pic:nvPicPr>
+                    <pic:cNvPr id="246813095" name=""/>
+                    <pic:cNvPicPr/>
+                  </pic:nvPicPr>
+                  <pic:blipFill>
+                    <a:blip r:embed="rId39"/>
+                    <a:stretch>
+                      <a:fillRect/>
+                    </a:stretch>
+                  </pic:blipFill>
+                  <pic:spPr>
+                    <a:xfrm>
+                      <a:off x="0" y="0"/>
+                      <a:ext cx="4020111" cy="2638793"/>
+                    </a:xfrm>
+                    <a:prstGeom prst="rect">
+                      <a:avLst/>
+                    </a:prstGeom>
+                  </pic:spPr>
+                </pic:pic>
+              </a:graphicData>
+            </a:graphic>
+          </wp:inline>
+        </w:drawing>
+      </w:r>
+    </w:p>
+    <w:p>
+      <w:pPr>
+        <w:rPr>
+          <w:rFonts w:ascii="Times New Roman" w:hAnsi="Times New Roman" w:cs="Times New Roman"/>
+          <w:sz w:val="24"/>
+          <w:szCs w:val="24"/>
+        </w:rPr>
+      </w:pPr>
+      <w:r>
+        <w:rPr>
+          <w:rFonts w:ascii="Times New Roman" w:hAnsi="Times New Roman" w:cs="Times New Roman"/>
+          <w:sz w:val="24"/>
+          <w:szCs w:val="24"/>
+        </w:rPr>
+        <w:drawing>
+          <wp:inline distT="0" distB="0" distL="0" distR="0" wp14:anchorId="6C7BEDDE" wp14:editId="69614A98">
+            <wp:extent cx="3839111" cy="3057952"/>
+            <wp:effectExtent l="0" t="0" r="9525" b="9525"/>
+            <wp:docPr id="1916855474" name="Picture 1"/>
+            <wp:cNvGraphicFramePr>
+              <a:graphicFrameLocks xmlns:a="http://schemas.openxmlformats.org/drawingml/2006/main" noChangeAspect="1"/>
+            </wp:cNvGraphicFramePr>
+            <a:graphic xmlns:a="http://schemas.openxmlformats.org/drawingml/2006/main">
+              <a:graphicData uri="http://schemas.openxmlformats.org/drawingml/2006/picture">
+                <pic:pic xmlns:pic="http://schemas.openxmlformats.org/drawingml/2006/picture">
+                  <pic:nvPicPr>
+                    <pic:cNvPr id="1916855474" name=""/>
+                    <pic:cNvPicPr/>
+                  </pic:nvPicPr>
+                  <pic:blipFill>
+                    <a:blip r:embed="rId40"/>
+                    <a:stretch>
+                      <a:fillRect/>
+                    </a:stretch>
+                  </pic:blipFill>
+                  <pic:spPr>
+                    <a:xfrm>
+                      <a:off x="0" y="0"/>
+                      <a:ext cx="3839111" cy="3057952"/>
+                    </a:xfrm>
+                    <a:prstGeom prst="rect">
+                      <a:avLst/>
+                    </a:prstGeom>
+                  </pic:spPr>
+                </pic:pic>
+              </a:graphicData>
+            </a:graphic>
+          </wp:inline>
+        </w:drawing>
+      </w:r>
+    </w:p>
+    <w:p>
+      <w:pPr>
+        <w:rPr>
+          <w:rFonts w:ascii="Times New Roman" w:hAnsi="Times New Roman" w:cs="Times New Roman"/>
+          <w:sz w:val="24"/>
+          <w:szCs w:val="24"/>
+        </w:rPr>
+      </w:pPr>
+      <w:r>
+        <w:rPr>
+          <w:rFonts w:ascii="Times New Roman" w:hAnsi="Times New Roman" w:cs="Times New Roman"/>
+          <w:sz w:val="24"/>
+          <w:szCs w:val="24"/>
+        </w:rPr>
+        <w:lastRenderedPageBreak/>
+        <w:drawing>
+          <wp:inline distT="0" distB="0" distL="0" distR="0" wp14:anchorId="04E255C7" wp14:editId="7A015AED">
+            <wp:extent cx="3962953" cy="4858428"/>
+            <wp:effectExtent l="0" t="0" r="0" b="0"/>
+            <wp:docPr id="1483555775" name="Picture 1"/>
+            <wp:cNvGraphicFramePr>
+              <a:graphicFrameLocks xmlns:a="http://schemas.openxmlformats.org/drawingml/2006/main" noChangeAspect="1"/>
+            </wp:cNvGraphicFramePr>
+            <a:graphic xmlns:a="http://schemas.openxmlformats.org/drawingml/2006/main">
+              <a:graphicData uri="http://schemas.openxmlformats.org/drawingml/2006/picture">
+                <pic:pic xmlns:pic="http://schemas.openxmlformats.org/drawingml/2006/picture">
+                  <pic:nvPicPr>
+                    <pic:cNvPr id="1483555775" name=""/>
+                    <pic:cNvPicPr/>
+                  </pic:nvPicPr>
+                  <pic:blipFill>
+                    <a:blip r:embed="rId41"/>
+                    <a:stretch>
+                      <a:fillRect/>
+                    </a:stretch>
+                  </pic:blipFill>
+                  <pic:spPr>
+                    <a:xfrm>
+                      <a:off x="0" y="0"/>
+                      <a:ext cx="3962953" cy="4858428"/>
+                    </a:xfrm>
+                    <a:prstGeom prst="rect">
+                      <a:avLst/>
+                    </a:prstGeom>
+                  </pic:spPr>
+                </pic:pic>
+              </a:graphicData>
+            </a:graphic>
+          </wp:inline>
+        </w:drawing>
+      </w:r>
+    </w:p>
+    <w:p>
+      <w:pPr>
+        <w:rPr>
+          <w:rFonts w:ascii="Times New Roman" w:hAnsi="Times New Roman" w:cs="Times New Roman"/>
+          <w:sz w:val="24"/>
+          <w:szCs w:val="24"/>
+        </w:rPr>
+      </w:pPr>
+      <w:r>
+        <w:rPr>
+          <w:rFonts w:ascii="Times New Roman" w:hAnsi="Times New Roman" w:cs="Times New Roman"/>
+          <w:sz w:val="24"/>
+          <w:szCs w:val="24"/>
+        </w:rPr>
+        <w:lastRenderedPageBreak/>
+        <w:drawing>
+          <wp:inline distT="0" distB="0" distL="0" distR="0" wp14:anchorId="2236F122" wp14:editId="30CD7527">
+            <wp:extent cx="4048690" cy="4925112"/>
+            <wp:effectExtent l="0" t="0" r="9525" b="8890"/>
+            <wp:docPr id="710886732" name="Picture 1"/>
+            <wp:cNvGraphicFramePr>
+              <a:graphicFrameLocks xmlns:a="http://schemas.openxmlformats.org/drawingml/2006/main" noChangeAspect="1"/>
+            </wp:cNvGraphicFramePr>
+            <a:graphic xmlns:a="http://schemas.openxmlformats.org/drawingml/2006/main">
+              <a:graphicData uri="http://schemas.openxmlformats.org/drawingml/2006/picture">
+                <pic:pic xmlns:pic="http://schemas.openxmlformats.org/drawingml/2006/picture">
+                  <pic:nvPicPr>
+                    <pic:cNvPr id="710886732" name=""/>
+                    <pic:cNvPicPr/>
+                  </pic:nvPicPr>
+                  <pic:blipFill>
+                    <a:blip r:embed="rId42"/>
+                    <a:stretch>
+                      <a:fillRect/>
+                    </a:stretch>
+                  </pic:blipFill>
+                  <pic:spPr>
+                    <a:xfrm>
+                      <a:off x="0" y="0"/>
+                      <a:ext cx="4048690" cy="4925112"/>
+                    </a:xfrm>
+                    <a:prstGeom prst="rect">
+                      <a:avLst/>
+                    </a:prstGeom>
+                  </pic:spPr>
+                </pic:pic>
+              </a:graphicData>
+            </a:graphic>
+          </wp:inline>
+        </w:drawing>
+      </w:r>
     </w:p>
     <w:p>
       <w:pPr>
@@ -3782,7 +4048,6 @@
                 <w:szCs w:val="24"/>
               </w:rPr>
             </w:pPr>
-            <w:proofErr w:type="gramStart"/>
             <w:r>
               <w:rPr>
                 <w:rFonts w:ascii="Times New Roman" w:hAnsi="Times New Roman" w:cs="Times New Roman"/>
@@ -3792,7 +4057,6 @@
               </w:rPr>
               <w:t>Address Relevant Implication</w:t>
             </w:r>
-            <w:proofErr w:type="gramEnd"/>
             <w:r>
               <w:rPr>
                 <w:rFonts w:ascii="Times New Roman" w:hAnsi="Times New Roman" w:cs="Times New Roman"/>
@@ -4783,23 +5047,13 @@
                 <w:szCs w:val="20"/>
               </w:rPr>
             </w:pPr>
-            <w:proofErr w:type="gramStart"/>
-            <w:r>
-              <w:rPr>
-                <w:rFonts w:ascii="Times New Roman" w:hAnsi="Times New Roman" w:cs="Times New Roman"/>
-                <w:sz w:val="20"/>
-                <w:szCs w:val="20"/>
-              </w:rPr>
-              <w:t>Enter</w:t>
-            </w:r>
-            <w:proofErr w:type="gramEnd"/>
-            <w:r>
-              <w:rPr>
-                <w:rFonts w:ascii="Times New Roman" w:hAnsi="Times New Roman" w:cs="Times New Roman"/>
-                <w:sz w:val="20"/>
-                <w:szCs w:val="20"/>
-              </w:rPr>
-              <w:t xml:space="preserve"> Alphabets in Age Field</w:t>
+            <w:r>
+              <w:rPr>
+                <w:rFonts w:ascii="Times New Roman" w:hAnsi="Times New Roman" w:cs="Times New Roman"/>
+                <w:sz w:val="20"/>
+                <w:szCs w:val="20"/>
+              </w:rPr>
+              <w:t>Enter Alphabets in Age Field</w:t>
             </w:r>
           </w:p>
         </w:tc>
@@ -4823,16 +5077,7 @@
                 <w:sz w:val="20"/>
                 <w:szCs w:val="20"/>
               </w:rPr>
-              <w:t xml:space="preserve">Error Message </w:t>
-            </w:r>
-            <w:r>
-              <w:rPr>
-                <w:rFonts w:ascii="Times New Roman" w:hAnsi="Times New Roman" w:cs="Times New Roman"/>
-                <w:sz w:val="20"/>
-                <w:szCs w:val="20"/>
-              </w:rPr>
-              <w:lastRenderedPageBreak/>
-              <w:t>Should Appear</w:t>
+              <w:t>Error Message Should Appear</w:t>
             </w:r>
           </w:p>
         </w:tc>
@@ -4856,7 +5101,6 @@
                 <w:sz w:val="20"/>
                 <w:szCs w:val="20"/>
               </w:rPr>
-              <w:lastRenderedPageBreak/>
               <w:t>No Error Message</w:t>
             </w:r>
           </w:p>
@@ -4908,16 +5152,7 @@
                 <w:sz w:val="20"/>
                 <w:szCs w:val="20"/>
               </w:rPr>
-              <w:t xml:space="preserve">Validation Check is Applied to </w:t>
-            </w:r>
-            <w:r>
-              <w:rPr>
-                <w:rFonts w:ascii="Times New Roman" w:hAnsi="Times New Roman" w:cs="Times New Roman"/>
-                <w:sz w:val="20"/>
-                <w:szCs w:val="20"/>
-              </w:rPr>
-              <w:lastRenderedPageBreak/>
-              <w:t xml:space="preserve">Accept only Numbers. </w:t>
+              <w:t xml:space="preserve">Validation Check is Applied to Accept only Numbers. </w:t>
             </w:r>
             <w:r>
               <w:rPr>
@@ -4955,7 +5190,6 @@
                 <w:sz w:val="20"/>
                 <w:szCs w:val="20"/>
               </w:rPr>
-              <w:lastRenderedPageBreak/>
               <w:t>4</w:t>
             </w:r>
           </w:p>
@@ -5383,7 +5617,16 @@
                 <w:sz w:val="20"/>
                 <w:szCs w:val="20"/>
               </w:rPr>
-              <w:t>Enter Data in Loan Table about a Device Lend to a Student Who Does Not Exist in Student Table</w:t>
+              <w:t xml:space="preserve">Enter Data in Loan Table about a Device Lend to a Student </w:t>
+            </w:r>
+            <w:r>
+              <w:rPr>
+                <w:rFonts w:ascii="Times New Roman" w:hAnsi="Times New Roman" w:cs="Times New Roman"/>
+                <w:sz w:val="20"/>
+                <w:szCs w:val="20"/>
+              </w:rPr>
+              <w:lastRenderedPageBreak/>
+              <w:t>Who Does Not Exist in Student Table</w:t>
             </w:r>
           </w:p>
         </w:tc>
@@ -5407,6 +5650,7 @@
                 <w:sz w:val="20"/>
                 <w:szCs w:val="20"/>
               </w:rPr>
+              <w:lastRenderedPageBreak/>
               <w:t>Error for non-existing record in student table</w:t>
             </w:r>
           </w:p>
@@ -5481,7 +5725,16 @@
                 <w:sz w:val="20"/>
                 <w:szCs w:val="20"/>
               </w:rPr>
-              <w:t>Relationship between Load and Student Table is Working Correctly</w:t>
+              <w:t xml:space="preserve">Relationship between Load and Student Table is </w:t>
+            </w:r>
+            <w:r>
+              <w:rPr>
+                <w:rFonts w:ascii="Times New Roman" w:hAnsi="Times New Roman" w:cs="Times New Roman"/>
+                <w:sz w:val="20"/>
+                <w:szCs w:val="20"/>
+              </w:rPr>
+              <w:lastRenderedPageBreak/>
+              <w:t>Working Correctly</w:t>
             </w:r>
           </w:p>
         </w:tc>
@@ -5510,6 +5763,7 @@
                 <w:sz w:val="20"/>
                 <w:szCs w:val="20"/>
               </w:rPr>
+              <w:lastRenderedPageBreak/>
               <w:t>7</w:t>
             </w:r>
           </w:p>
@@ -6460,25 +6714,7 @@
           <w:sz w:val="18"/>
           <w:szCs w:val="24"/>
         </w:rPr>
-        <w:t xml:space="preserve">Make sure to record iterative improvement in the </w:t>
-      </w:r>
-      <w:proofErr w:type="gramStart"/>
-      <w:r>
-        <w:rPr>
-          <w:rFonts w:ascii="Times New Roman" w:hAnsi="Times New Roman" w:cs="Times New Roman"/>
-          <w:sz w:val="18"/>
-          <w:szCs w:val="24"/>
-        </w:rPr>
-        <w:t>below table</w:t>
-      </w:r>
-      <w:proofErr w:type="gramEnd"/>
-      <w:r>
-        <w:rPr>
-          <w:rFonts w:ascii="Times New Roman" w:hAnsi="Times New Roman" w:cs="Times New Roman"/>
-          <w:sz w:val="18"/>
-          <w:szCs w:val="24"/>
-        </w:rPr>
-        <w:t xml:space="preserve"> as well as video evidence.)</w:t>
+        <w:t>Make sure to record iterative improvement in the below table as well as video evidence.)</w:t>
       </w:r>
     </w:p>
     <w:p>
@@ -6515,27 +6751,7 @@
           <w:sz w:val="18"/>
           <w:szCs w:val="24"/>
         </w:rPr>
-        <w:t xml:space="preserve"> </w:t>
-      </w:r>
-      <w:proofErr w:type="gramStart"/>
-      <w:r>
-        <w:rPr>
-          <w:rFonts w:ascii="Times New Roman" w:hAnsi="Times New Roman" w:cs="Times New Roman"/>
-          <w:color w:val="FF0000"/>
-          <w:sz w:val="18"/>
-          <w:szCs w:val="24"/>
-        </w:rPr>
-        <w:t>is</w:t>
-      </w:r>
-      <w:proofErr w:type="gramEnd"/>
-      <w:r>
-        <w:rPr>
-          <w:rFonts w:ascii="Times New Roman" w:hAnsi="Times New Roman" w:cs="Times New Roman"/>
-          <w:color w:val="FF0000"/>
-          <w:sz w:val="18"/>
-          <w:szCs w:val="24"/>
-        </w:rPr>
-        <w:t xml:space="preserve"> required throughout the design, development and testing process.</w:t>
+        <w:t xml:space="preserve"> is required throughout the design, development and testing process.</w:t>
       </w:r>
     </w:p>
     <w:tbl>
@@ -6830,7 +7046,6 @@
                 <w:sz w:val="20"/>
                 <w:szCs w:val="24"/>
               </w:rPr>
-              <w:lastRenderedPageBreak/>
               <w:t>2</w:t>
             </w:r>
           </w:p>
@@ -7253,25 +7468,7 @@
           <w:sz w:val="18"/>
           <w:szCs w:val="24"/>
         </w:rPr>
-        <w:t xml:space="preserve"> show how queries, forms, sorting, and field </w:t>
-      </w:r>
-      <w:proofErr w:type="spellStart"/>
-      <w:r>
-        <w:rPr>
-          <w:rFonts w:ascii="Times New Roman" w:hAnsi="Times New Roman" w:cs="Times New Roman"/>
-          <w:sz w:val="18"/>
-          <w:szCs w:val="24"/>
-        </w:rPr>
-        <w:t>organisation</w:t>
-      </w:r>
-      <w:proofErr w:type="spellEnd"/>
-      <w:r>
-        <w:rPr>
-          <w:rFonts w:ascii="Times New Roman" w:hAnsi="Times New Roman" w:cs="Times New Roman"/>
-          <w:sz w:val="18"/>
-          <w:szCs w:val="24"/>
-        </w:rPr>
-        <w:t xml:space="preserve"> help users easily enter data and retrieve the information they need.)</w:t>
+        <w:t xml:space="preserve"> show how queries, forms, sorting, and field organisation help users easily enter data and retrieve the information they need.)</w:t>
       </w:r>
     </w:p>
     <w:sectPr>
@@ -7945,6 +8142,7 @@
   <w:style w:type="character" w:default="1" w:styleId="DefaultParagraphFont">
     <w:name w:val="Default Paragraph Font"/>
     <w:uiPriority w:val="1"/>
+    <w:semiHidden/>
     <w:unhideWhenUsed/>
   </w:style>
   <w:style w:type="table" w:default="1" w:styleId="TableNormal">

</xml_diff>